<commit_message>
Visual polish: pre-seed deck + global report with India-first roadmap
</commit_message>
<xml_diff>
--- a/A priyam ka patora/Startup Ideas/03 - Ecommerce Hub/Ecommerce_Hub_Global_Report.docx
+++ b/A priyam ka patora/Startup Ideas/03 - Ecommerce Hub/Ecommerce_Hub_Global_Report.docx
@@ -2,9 +2,176 @@
 <file path=word/document.xml><?xml version="1.0" encoding="utf-8"?>
 <w:document xmlns:wpc="http://schemas.microsoft.com/office/word/2010/wordprocessingCanvas" xmlns:mc="http://schemas.openxmlformats.org/markup-compatibility/2006" xmlns:o="urn:schemas-microsoft-com:office:office" xmlns:r="http://schemas.openxmlformats.org/officeDocument/2006/relationships" xmlns:m="http://schemas.openxmlformats.org/officeDocument/2006/math" xmlns:v="urn:schemas-microsoft-com:vml" xmlns:wp14="http://schemas.microsoft.com/office/word/2010/wordprocessingDrawing" xmlns:wp="http://schemas.openxmlformats.org/drawingml/2006/wordprocessingDrawing" xmlns:w10="urn:schemas-microsoft-com:office:word" xmlns:w="http://schemas.openxmlformats.org/wordprocessingml/2006/main" xmlns:w14="http://schemas.microsoft.com/office/word/2010/wordml" xmlns:w15="http://schemas.microsoft.com/office/word/2012/wordml" xmlns:wpg="http://schemas.microsoft.com/office/word/2010/wordprocessingGroup" xmlns:wpi="http://schemas.microsoft.com/office/word/2010/wordprocessingInk" xmlns:wne="http://schemas.microsoft.com/office/word/2006/wordml" xmlns:wps="http://schemas.microsoft.com/office/word/2010/wordprocessingShape" xmlns:cx="http://schemas.microsoft.com/office/drawing/2014/chartex" xmlns:cx1="http://schemas.microsoft.com/office/drawing/2015/9/8/chartex" xmlns:cx2="http://schemas.microsoft.com/office/drawing/2015/10/21/chartex" xmlns:cx3="http://schemas.microsoft.com/office/drawing/2016/5/9/chartex" xmlns:cx4="http://schemas.microsoft.com/office/drawing/2016/5/10/chartex" xmlns:cx5="http://schemas.microsoft.com/office/drawing/2016/5/11/chartex" xmlns:cx6="http://schemas.microsoft.com/office/drawing/2016/5/12/chartex" xmlns:cx7="http://schemas.microsoft.com/office/drawing/2016/5/13/chartex" xmlns:cx8="http://schemas.microsoft.com/office/drawing/2016/5/14/chartex" xmlns:aink="http://schemas.microsoft.com/office/drawing/2016/ink" xmlns:am3d="http://schemas.microsoft.com/office/drawing/2017/model3d" xmlns:w16cex="http://schemas.microsoft.com/office/word/2018/wordml/cex" xmlns:w16cid="http://schemas.microsoft.com/office/word/2016/wordml/cid" xmlns:w16="http://schemas.microsoft.com/office/word/2018/wordml" xmlns:w16sdtdh="http://schemas.microsoft.com/office/word/2020/wordml/sdtdatahash" xmlns:w16se="http://schemas.microsoft.com/office/word/2015/wordml/symex" mc:Ignorable="w14 w15 wp14">
   <w:body>
-    <w:p>
-      <w:pPr>
-        <w:spacing w:after="100"/>
+    <w:tbl>
+      <w:tblPr>
+        <w:tblW w:type="dxa" w:w="12240"/>
+        <w:tblBorders>
+          <w:top w:val="single" w:color="auto" w:sz="4"/>
+          <w:left w:val="single" w:color="auto" w:sz="4"/>
+          <w:bottom w:val="single" w:color="auto" w:sz="4"/>
+          <w:right w:val="single" w:color="auto" w:sz="4"/>
+          <w:insideH w:val="single" w:color="auto" w:sz="4"/>
+          <w:insideV w:val="single" w:color="auto" w:sz="4"/>
+        </w:tblBorders>
+      </w:tblPr>
+      <w:tblGrid>
+        <w:gridCol w:w="12240"/>
+      </w:tblGrid>
+      <w:tr>
+        <w:tc>
+          <w:tcPr>
+            <w:tcW w:type="dxa" w:w="12240"/>
+            <w:shd w:fill="1F2A5C" w:val="clear"/>
+            <w:tcMar>
+              <w:top w:type="dxa" w:w="3600"/>
+              <w:left w:type="dxa" w:w="1200"/>
+              <w:bottom w:type="dxa" w:w="3600"/>
+              <w:right w:type="dxa" w:w="1200"/>
+            </w:tcMar>
+          </w:tcPr>
+          <w:p>
+            <w:pPr>
+              <w:spacing w:after="240"/>
+            </w:pPr>
+            <w:r>
+              <w:rPr>
+                <w:rFonts w:ascii="Cambria" w:cs="Cambria" w:eastAsia="Cambria" w:hAnsi="Cambria"/>
+                <w:b/>
+                <w:bCs/>
+                <w:color w:val="FFFFFF"/>
+                <w:sz w:val="56"/>
+                <w:szCs w:val="56"/>
+              </w:rPr>
+              <w:t xml:space="preserve">ECOMMERCE HUB</w:t>
+            </w:r>
+          </w:p>
+          <w:p>
+            <w:pPr>
+              <w:pBdr>
+                <w:bottom w:val="single" w:color="F96167" w:sz="4" w:space="12"/>
+              </w:pBdr>
+              <w:spacing w:after="160"/>
+            </w:pPr>
+            <w:r>
+              <w:rPr>
+                <w:b/>
+                <w:bCs/>
+                <w:color w:val="F9E795"/>
+                <w:spacing w:val="30"/>
+                <w:sz w:val="22"/>
+                <w:szCs w:val="22"/>
+              </w:rPr>
+              <w:t xml:space="preserve">GOING GLOBAL</w:t>
+            </w:r>
+          </w:p>
+          <w:p>
+            <w:pPr>
+              <w:spacing w:after="800"/>
+            </w:pPr>
+            <w:r>
+              <w:rPr>
+                <w:rFonts w:ascii="Cambria" w:cs="Cambria" w:eastAsia="Cambria" w:hAnsi="Cambria"/>
+                <w:i/>
+                <w:iCs/>
+                <w:color w:val="D8DCF0"/>
+                <w:sz w:val="30"/>
+                <w:szCs w:val="30"/>
+              </w:rPr>
+              <w:t xml:space="preserve">Market, Competitors, Feature Roadmap &amp; an Honest Risk Assessment</w:t>
+            </w:r>
+          </w:p>
+          <w:p>
+            <w:pPr>
+              <w:spacing w:after="120"/>
+            </w:pPr>
+            <w:r>
+              <w:rPr>
+                <w:color w:val="9AA3C7"/>
+                <w:sz w:val="20"/>
+                <w:szCs w:val="20"/>
+              </w:rPr>
+              <w:t xml:space="preserve">Prepared for Priyam  ·  August 2026</w:t>
+            </w:r>
+          </w:p>
+          <w:p>
+            <w:r>
+              <w:rPr>
+                <w:b/>
+                <w:bCs/>
+                <w:color w:val="FFFFFF"/>
+                <w:sz w:val="16"/>
+                <w:szCs w:val="16"/>
+                <w:shd w:fill="1A7A3C" w:val="clear"/>
+              </w:rPr>
+              <w:t xml:space="preserve"> VERIFIED </w:t>
+            </w:r>
+            <w:r>
+              <w:rPr>
+                <w:color w:val="9AA3C7"/>
+                <w:sz w:val="16"/>
+                <w:szCs w:val="16"/>
+              </w:rPr>
+              <w:t xml:space="preserve">  independently confirmed source     </w:t>
+            </w:r>
+            <w:r>
+              <w:rPr>
+                <w:b/>
+                <w:bCs/>
+                <w:color w:val="FFFFFF"/>
+                <w:sz w:val="16"/>
+                <w:szCs w:val="16"/>
+                <w:shd w:fill="B8860B" w:val="clear"/>
+              </w:rPr>
+              <w:t xml:space="preserve"> VENDOR CLAIM </w:t>
+            </w:r>
+            <w:r>
+              <w:rPr>
+                <w:color w:val="9AA3C7"/>
+                <w:sz w:val="16"/>
+                <w:szCs w:val="16"/>
+              </w:rPr>
+              <w:t xml:space="preserve">  company's own marketing     </w:t>
+            </w:r>
+            <w:r>
+              <w:rPr>
+                <w:b/>
+                <w:bCs/>
+                <w:color w:val="FFFFFF"/>
+                <w:sz w:val="16"/>
+                <w:szCs w:val="16"/>
+                <w:shd w:fill="F96167" w:val="clear"/>
+              </w:rPr>
+              <w:t xml:space="preserve"> INFERENCE </w:t>
+            </w:r>
+            <w:r>
+              <w:rPr>
+                <w:color w:val="9AA3C7"/>
+                <w:sz w:val="16"/>
+                <w:szCs w:val="16"/>
+              </w:rPr>
+              <w:t xml:space="preserve">  Claude's own synthesis, not sourced fact</w:t>
+            </w:r>
+          </w:p>
+        </w:tc>
+      </w:tr>
+    </w:tbl>
+    <w:p>
+      <w:pPr>
+        <w:sectPr>
+          <w:pgSz w:w="12240" w:h="15840" w:orient="portrait"/>
+          <w:pgMar w:top="0" w:right="0" w:bottom="0" w:left="0" w:header="708" w:footer="708" w:gutter="0"/>
+          <w:pgNumType/>
+          <w:docGrid w:linePitch="360"/>
+        </w:sectPr>
+      </w:pPr>
+    </w:p>
+    <w:p>
+      <w:pPr>
+        <w:pStyle w:val="Heading1"/>
+        <w:pBdr>
+          <w:top w:val="single" w:color="F96167" w:sz="14" w:space="8"/>
+        </w:pBdr>
+        <w:spacing w:after="40" w:before="420"/>
       </w:pPr>
       <w:r>
         <w:rPr>
@@ -12,105 +179,92 @@
           <w:b/>
           <w:bCs/>
           <w:color w:val="2F3C7E"/>
-          <w:sz w:val="44"/>
-          <w:szCs w:val="44"/>
-        </w:rPr>
-        <w:t xml:space="preserve">ECOMMERCE HUB</w:t>
-      </w:r>
-    </w:p>
-    <w:p>
-      <w:pPr>
-        <w:spacing w:after="100"/>
-      </w:pPr>
-      <w:r>
-        <w:rPr>
-          <w:rFonts w:ascii="Cambria" w:cs="Cambria" w:eastAsia="Cambria" w:hAnsi="Cambria"/>
-          <w:i/>
-          <w:iCs/>
+          <w:sz w:val="32"/>
+          <w:szCs w:val="32"/>
+        </w:rPr>
+        <w:t xml:space="preserve">Executive Summary</w:t>
+      </w:r>
+    </w:p>
+    <w:p>
+      <w:pPr>
+        <w:spacing w:after="200" w:line="300"/>
+      </w:pPr>
+      <w:r>
+        <w:rPr>
           <w:color w:val="1B1F3B"/>
-          <w:sz w:val="28"/>
-          <w:szCs w:val="28"/>
-        </w:rPr>
-        <w:t xml:space="preserve">Going Global: Market, Competitors, Features &amp; Honest Risk Assessment</w:t>
-      </w:r>
-    </w:p>
-    <w:p>
-      <w:pPr>
-        <w:pBdr>
-          <w:bottom w:val="single" w:color="CCCCCC" w:sz="6" w:space="8"/>
-        </w:pBdr>
-        <w:spacing w:after="400"/>
-      </w:pPr>
-      <w:r>
-        <w:rPr>
-          <w:color w:val="6B7280"/>
-          <w:sz w:val="18"/>
-          <w:szCs w:val="18"/>
-        </w:rPr>
-        <w:t xml:space="preserve">Prepared for Priyam · August 2026 · Confidence tags used throughout: </w:t>
-      </w:r>
+        </w:rPr>
+        <w:t xml:space="preserve">You asked for three things: research this as a global product instead of an India-first one, add features I think would make it more attractive, and put it all in one detailed, easy-to-scan report — including a proper phased plan that starts with India immersion. Here it is, most important finding first, not buried at the end.</w:t>
+      </w:r>
+    </w:p>
+    <w:p>
+      <w:pPr>
+        <w:spacing w:after="200" w:line="300"/>
+      </w:pPr>
       <w:r>
         <w:rPr>
           <w:b/>
           <w:bCs/>
-          <w:color w:val="1A7A3C"/>
-          <w:sz w:val="18"/>
-          <w:szCs w:val="18"/>
-        </w:rPr>
-        <w:t xml:space="preserve">[VERIFIED]</w:t>
-      </w:r>
-      <w:r>
-        <w:rPr>
-          <w:color w:val="6B7280"/>
-          <w:sz w:val="18"/>
-          <w:szCs w:val="18"/>
-        </w:rPr>
-        <w:t xml:space="preserve"> = independently confirmed source · </w:t>
-      </w:r>
-      <w:r>
-        <w:rPr>
+          <w:color w:val="FFFFFF"/>
+          <w:sz w:val="17"/>
+          <w:szCs w:val="17"/>
+          <w:shd w:fill="F96167" w:val="clear"/>
+        </w:rPr>
+        <w:t xml:space="preserve"> INFERENCE </w:t>
+      </w:r>
+      <w:r>
+        <w:rPr>
+          <w:sz w:val="22"/>
+          <w:szCs w:val="22"/>
+        </w:rPr>
+        <w:t xml:space="preserve">  Going global trades away the one verified, defensible advantage this idea currently has. The India-native gap (no major global tool supports Razorpay or Indian logistics) is a specific, source-confirmed hole in the market. "Global" has no equivalent confirmed hole — the same big, funded players already claim to serve the whole world.</w:t>
+      </w:r>
+    </w:p>
+    <w:p>
+      <w:pPr>
+        <w:spacing w:after="200" w:line="300"/>
+      </w:pPr>
+      <w:r>
+        <w:rPr>
+          <w:color w:val="1B1F3B"/>
+        </w:rPr>
+        <w:t xml:space="preserve">That doesn't mean don't do it — it means sequencing matters. Section 2 lays out why. Section 8 turns that into the actual phased roadmap: India immersion first, global earned later, not assumed up front.</w:t>
+      </w:r>
+    </w:p>
+    <w:p>
+      <w:pPr>
+        <w:pStyle w:val="Heading1"/>
+        <w:pBdr>
+          <w:top w:val="single" w:color="F96167" w:sz="14" w:space="8"/>
+        </w:pBdr>
+        <w:spacing w:after="40" w:before="420"/>
+      </w:pPr>
+      <w:r>
+        <w:rPr>
+          <w:rFonts w:ascii="Cambria" w:cs="Cambria" w:eastAsia="Cambria" w:hAnsi="Cambria"/>
           <w:b/>
           <w:bCs/>
-          <w:color w:val="B8860B"/>
-          <w:sz w:val="18"/>
-          <w:szCs w:val="18"/>
-        </w:rPr>
-        <w:t xml:space="preserve">[VENDOR CLAIM]</w:t>
-      </w:r>
-      <w:r>
-        <w:rPr>
-          <w:color w:val="6B7280"/>
-          <w:sz w:val="18"/>
-          <w:szCs w:val="18"/>
-        </w:rPr>
-        <w:t xml:space="preserve"> = company's own marketing only · </w:t>
-      </w:r>
-      <w:r>
-        <w:rPr>
+          <w:color w:val="2F3C7E"/>
+          <w:sz w:val="32"/>
+          <w:szCs w:val="32"/>
+        </w:rPr>
+        <w:t xml:space="preserve">2. The Global Pivot — What Actually Changes</w:t>
+      </w:r>
+    </w:p>
+    <w:p>
+      <w:pPr>
+        <w:pStyle w:val="Heading2"/>
+        <w:spacing w:after="140" w:before="280"/>
+      </w:pPr>
+      <w:r>
+        <w:rPr>
+          <w:rFonts w:ascii="Cambria" w:cs="Cambria" w:eastAsia="Cambria" w:hAnsi="Cambria"/>
           <w:b/>
           <w:bCs/>
           <w:color w:val="F96167"/>
-          <w:sz w:val="18"/>
-          <w:szCs w:val="18"/>
-        </w:rPr>
-        <w:t xml:space="preserve">[INFERENCE]</w:t>
-      </w:r>
-      <w:r>
-        <w:rPr>
-          <w:color w:val="6B7280"/>
-          <w:sz w:val="18"/>
-          <w:szCs w:val="18"/>
-        </w:rPr>
-        <w:t xml:space="preserve"> = Claude's own synthesis/opinion, not sourced fact</w:t>
-      </w:r>
-    </w:p>
-    <w:p>
-      <w:pPr>
-        <w:pStyle w:val="Heading1"/>
-        <w:spacing w:after="200" w:before="400"/>
-      </w:pPr>
-      <w:r>
-        <w:t xml:space="preserve">Executive Summary</w:t>
+          <w:sz w:val="26"/>
+          <w:szCs w:val="26"/>
+        </w:rPr>
+        <w:t xml:space="preserve">2.1 What you lose</w:t>
       </w:r>
     </w:p>
     <w:p>
@@ -118,7 +272,10 @@
         <w:spacing w:after="200" w:line="300"/>
       </w:pPr>
       <w:r>
-        <w:t xml:space="preserve">You asked for three things: research this as a global product instead of an India-first one, add features I think would make it more attractive, and put it all in one detailed report. Here it is — but the most important finding comes first, not buried at the end.</w:t>
+        <w:rPr>
+          <w:color w:val="1B1F3B"/>
+        </w:rPr>
+        <w:t xml:space="preserve">Checking Triple Whale's own integration documentation directly confirmed it has zero support for Razorpay or any Indian logistics carrier — the same is true of Polar Analytics, Northbeam, Rockerbox, Daasity, and Glew. That is a real, checkable hole, and the reason "India-first" has a genuine answer to "why can't a customer just use Triple Whale."</w:t>
       </w:r>
     </w:p>
     <w:p>
@@ -127,20 +284,38 @@
       </w:pPr>
       <w:r>
         <w:rPr>
+          <w:b/>
+          <w:bCs/>
+          <w:color w:val="FFFFFF"/>
+          <w:sz w:val="17"/>
+          <w:szCs w:val="17"/>
+          <w:shd w:fill="1A7A3C" w:val="clear"/>
+        </w:rPr>
+        <w:t xml:space="preserve"> VERIFIED </w:t>
+      </w:r>
+      <w:r>
+        <w:rPr>
+          <w:sz w:val="22"/>
+          <w:szCs w:val="22"/>
+        </w:rPr>
+        <w:t xml:space="preserve">  "Global" does not have an equivalent hole. Triple Whale's own help center explicitly states it supports foreign currencies with automatic conversion — it already actively markets itself as usable outside the US.</w:t>
+      </w:r>
+    </w:p>
+    <w:p>
+      <w:pPr>
+        <w:pStyle w:val="Heading2"/>
+        <w:spacing w:after="140" w:before="280"/>
+      </w:pPr>
+      <w:r>
+        <w:rPr>
+          <w:rFonts w:ascii="Cambria" w:cs="Cambria" w:eastAsia="Cambria" w:hAnsi="Cambria"/>
           <w:b/>
           <w:bCs/>
           <w:color w:val="F96167"/>
-          <w:sz w:val="18"/>
-          <w:szCs w:val="18"/>
-        </w:rPr>
-        <w:t xml:space="preserve"> [INFERENCE] </w:t>
-      </w:r>
-      <w:r>
-        <w:rPr>
-          <w:sz w:val="22"/>
-          <w:szCs w:val="22"/>
-        </w:rPr>
-        <w:t xml:space="preserve">Going global trades away the one verified, defensible advantage this idea currently has. The India-native gap (no major global tool supports Razorpay or Indian logistics) is a specific, source-confirmed hole in the market. "Global" has no equivalent confirmed hole — the same big, funded players already claim to serve the whole world.</w:t>
+          <w:sz w:val="26"/>
+          <w:szCs w:val="26"/>
+        </w:rPr>
+        <w:t xml:space="preserve">2.2 What you gain</w:t>
       </w:r>
     </w:p>
     <w:p>
@@ -148,136 +323,87 @@
         <w:spacing w:after="200" w:line="300"/>
       </w:pPr>
       <w:r>
-        <w:t xml:space="preserve">That doesn't mean don't do it. It means the honest sequencing matters: prove the India wedge works with real paying customers first, then expand outward using the same underserved-payment-ecosystem pattern in other emerging markets, rather than launching everywhere at once with an unproven product. The detail on why is in Section 2.</w:t>
-      </w:r>
-    </w:p>
-    <w:p>
-      <w:pPr>
-        <w:spacing w:after="200" w:line="300"/>
-      </w:pPr>
-      <w:r>
-        <w:t xml:space="preserve">Section 3 covers the actual global market size, verified. Section 4 is the full competitive landscape, expanded from India-only to global, including a look at Southeast Asia, Latin America, Europe, and the Middle East. Section 5 is a feature roadmap — my own recommendations for what would make this product genuinely more attractive, clearly separated from what's already validated by research. Section 6 covers business model and go-to-market at global scale. Section 7 is the risk register. Section 8 is the bottom-line recommendation.</w:t>
-      </w:r>
-    </w:p>
-    <w:p>
-      <w:pPr>
-        <w:pStyle w:val="Heading1"/>
-        <w:spacing w:after="200" w:before="400"/>
-      </w:pPr>
-      <w:r>
-        <w:t xml:space="preserve">2. The Global Pivot — What Actually Changes</w:t>
+        <w:rPr>
+          <w:color w:val="1B1F3B"/>
+        </w:rPr>
+        <w:t xml:space="preserve">A much bigger total addressable market to point to (Section 3), and a product not capped by one country's growth rate. It also trades the DPDP Act for GDPR, CCPA, LGPD, and others simultaneously — a real cost, not a footnote.</w:t>
       </w:r>
     </w:p>
     <w:p>
       <w:pPr>
         <w:pStyle w:val="Heading2"/>
-        <w:spacing w:after="150" w:before="300"/>
-      </w:pPr>
-      <w:r>
-        <w:t xml:space="preserve">2.1 What you lose</w:t>
-      </w:r>
-    </w:p>
-    <w:p>
-      <w:pPr>
-        <w:spacing w:after="200" w:line="300"/>
-      </w:pPr>
-      <w:r>
-        <w:t xml:space="preserve">The single most valuable finding across all the research done on this idea so far is narrow and specific: checking Triple Whale's own integration documentation directly confirmed it has zero support for Razorpay or any Indian logistics carrier — and the same is true of Polar Analytics, Northbeam, Rockerbox, Daasity, and Glew. That is a real, checkable hole. It is the reason "Ecommerce Hub, India-first" has a genuine answer to "why can't a customer just use Triple Whale."</w:t>
-      </w:r>
-    </w:p>
-    <w:p>
-      <w:pPr>
-        <w:spacing w:after="200" w:line="300"/>
-      </w:pPr>
-      <w:r>
-        <w:rPr>
-          <w:b/>
-          <w:bCs/>
-          <w:color w:val="1A7A3C"/>
-          <w:sz w:val="18"/>
-          <w:szCs w:val="18"/>
-        </w:rPr>
-        <w:t xml:space="preserve"> [VERIFIED] </w:t>
-      </w:r>
-      <w:r>
-        <w:rPr>
-          <w:sz w:val="22"/>
-          <w:szCs w:val="22"/>
-        </w:rPr>
-        <w:t xml:space="preserve">"Global" does not have an equivalent hole. Triple Whale's own help center explicitly states it supports foreign currencies with automatic conversion — meaning it already actively markets itself as usable outside the US.</w:t>
-      </w:r>
-    </w:p>
-    <w:p>
-      <w:pPr>
-        <w:spacing w:after="200" w:line="300"/>
-      </w:pPr>
-      <w:r>
-        <w:t xml:space="preserve">So the pitch "why can't a customer just use Triple Whale" gets much harder to answer once the target customer is a generic global D2C brand instead of an Indian one.</w:t>
-      </w:r>
-    </w:p>
-    <w:p>
-      <w:pPr>
-        <w:pStyle w:val="Heading2"/>
-        <w:spacing w:after="150" w:before="300"/>
-      </w:pPr>
-      <w:r>
-        <w:t xml:space="preserve">2.2 What you gain</w:t>
-      </w:r>
-    </w:p>
-    <w:p>
-      <w:pPr>
-        <w:spacing w:after="200" w:line="300"/>
-      </w:pPr>
-      <w:r>
-        <w:t xml:space="preserve">A much bigger total addressable market to point to (Section 3), and a product that isn't capped by one country's growth rate. It also removes the DPDP Act as the only regulatory framework to worry about — global means GDPR (EU), CCPA (California), LGPD (Brazil), and others, each with their own compliance requirements, which is a real cost, not a footnote.</w:t>
-      </w:r>
-    </w:p>
-    <w:p>
-      <w:pPr>
-        <w:pStyle w:val="Heading2"/>
-        <w:spacing w:after="150" w:before="300"/>
-      </w:pPr>
-      <w:r>
-        <w:t xml:space="preserve">2.3 The honest middle path</w:t>
-      </w:r>
-    </w:p>
-    <w:p>
-      <w:pPr>
-        <w:spacing w:after="200" w:line="300"/>
-      </w:pPr>
-      <w:r>
-        <w:rPr>
+        <w:spacing w:after="140" w:before="280"/>
+      </w:pPr>
+      <w:r>
+        <w:rPr>
+          <w:rFonts w:ascii="Cambria" w:cs="Cambria" w:eastAsia="Cambria" w:hAnsi="Cambria"/>
           <w:b/>
           <w:bCs/>
           <w:color w:val="F96167"/>
-          <w:sz w:val="18"/>
-          <w:szCs w:val="18"/>
-        </w:rPr>
-        <w:t xml:space="preserve"> [INFERENCE] </w:t>
+          <w:sz w:val="26"/>
+          <w:szCs w:val="26"/>
+        </w:rPr>
+        <w:t xml:space="preserve">2.3 The honest middle path</w:t>
+      </w:r>
+    </w:p>
+    <w:p>
+      <w:pPr>
+        <w:spacing w:after="200" w:line="300"/>
+      </w:pPr>
+      <w:r>
+        <w:rPr>
+          <w:b/>
+          <w:bCs/>
+          <w:color w:val="FFFFFF"/>
+          <w:sz w:val="17"/>
+          <w:szCs w:val="17"/>
+          <w:shd w:fill="F96167" w:val="clear"/>
+        </w:rPr>
+        <w:t xml:space="preserve"> INFERENCE </w:t>
       </w:r>
       <w:r>
         <w:rPr>
           <w:sz w:val="22"/>
           <w:szCs w:val="22"/>
         </w:rPr>
-        <w:t xml:space="preserve">The research turned up a pattern worth taking seriously: the same kind of gap that exists for India (a major local payment/logistics ecosystem the big global tools don't integrate) plausibly exists in other emerging markets too — Mercado Pago in Latin America, GrabPay and J&amp;T Express in Southeast Asia, Klarna/iDEAL in parts of Europe. This was NOT independently confirmed in this research pass (the research explicitly could not verify or disprove whether Polar, Northbeam, Rockerbox, Daasity, Glew, Lifetimely, Putler, or Supermetrics support or exclude these) — it is a hypothesis, not a finding.</w:t>
-      </w:r>
-    </w:p>
-    <w:p>
-      <w:pPr>
-        <w:spacing w:after="200" w:line="300"/>
-      </w:pPr>
-      <w:r>
-        <w:t xml:space="preserve">If that hypothesis holds, the real strategic move is not "India-only" versus "everywhere at once" — it's "win one underserved emerging-payment-ecosystem market first, prove the model, then repeat the same playbook in the next one." That is a fundamentally different, and much more fundable, story than "we built a global analytics tool." It should be validated directly (checking Polar/Putler/Supermetrics docs for Mercado Pago/GrabPay/Klarna support) before being relied on.</w:t>
+        <w:t xml:space="preserve">  The same kind of gap that exists for India — a major local payment/logistics ecosystem the big global tools don't integrate — plausibly exists elsewhere too: Mercado Pago in Latin America, GrabPay and J&amp;T Express in Southeast Asia, Klarna/iDEAL in parts of Europe. This was NOT independently confirmed in this research pass — it is a hypothesis to validate directly, not a finding to build on yet.</w:t>
       </w:r>
     </w:p>
     <w:p>
       <w:pPr>
         <w:pStyle w:val="Heading1"/>
-        <w:spacing w:after="200" w:before="400"/>
-      </w:pPr>
-      <w:r>
-        <w:t xml:space="preserve">3. Global Market Opportunity</w:t>
+        <w:pBdr>
+          <w:top w:val="single" w:color="F96167" w:sz="14" w:space="8"/>
+        </w:pBdr>
+        <w:spacing w:after="40" w:before="420"/>
+      </w:pPr>
+      <w:r>
+        <w:rPr>
+          <w:rFonts w:ascii="Cambria" w:cs="Cambria" w:eastAsia="Cambria" w:hAnsi="Cambria"/>
+          <w:b/>
+          <w:bCs/>
+          <w:color w:val="2F3C7E"/>
+          <w:sz w:val="32"/>
+          <w:szCs w:val="32"/>
+        </w:rPr>
+        <w:t xml:space="preserve">3. Market Opportunity — India Now, Global Later</w:t>
+      </w:r>
+    </w:p>
+    <w:p>
+      <w:pPr>
+        <w:pStyle w:val="Heading2"/>
+        <w:spacing w:after="140" w:before="280"/>
+      </w:pPr>
+      <w:r>
+        <w:rPr>
+          <w:rFonts w:ascii="Cambria" w:cs="Cambria" w:eastAsia="Cambria" w:hAnsi="Cambria"/>
+          <w:b/>
+          <w:bCs/>
+          <w:color w:val="F96167"/>
+          <w:sz w:val="26"/>
+          <w:szCs w:val="26"/>
+        </w:rPr>
+        <w:t xml:space="preserve">3.1 India, today's focus</w:t>
       </w:r>
     </w:p>
     <w:tbl>
@@ -293,345 +419,122 @@
         </w:tblBorders>
       </w:tblPr>
       <w:tblGrid>
-        <w:gridCol w:w="4200"/>
-        <w:gridCol w:w="2400"/>
-        <w:gridCol w:w="2426"/>
+        <w:gridCol w:w="3008"/>
+        <w:gridCol w:w="3008"/>
+        <w:gridCol w:w="3008"/>
       </w:tblGrid>
       <w:tr>
-        <w:trPr>
-          <w:tblHeader/>
-        </w:trPr>
-        <w:tc>
-          <w:tcPr>
-            <w:tcW w:type="dxa" w:w="4200"/>
-            <w:shd w:fill="2F3C7E" w:val="clear"/>
-          </w:tcPr>
-          <w:p>
-            <w:r>
-              <w:rPr>
+        <w:tc>
+          <w:tcPr>
+            <w:tcW w:type="dxa" w:w="3008"/>
+            <w:shd w:fill="F7F7F6" w:val="clear"/>
+            <w:tcMar>
+              <w:top w:type="dxa" w:w="160"/>
+              <w:left w:type="dxa" w:w="160"/>
+              <w:bottom w:type="dxa" w:w="160"/>
+              <w:right w:type="dxa" w:w="160"/>
+            </w:tcMar>
+          </w:tcPr>
+          <w:p>
+            <w:pPr>
+              <w:spacing w:after="60"/>
+            </w:pPr>
+            <w:r>
+              <w:rPr>
+                <w:rFonts w:ascii="Cambria" w:cs="Cambria" w:eastAsia="Cambria" w:hAnsi="Cambria"/>
                 <w:b/>
                 <w:bCs/>
-                <w:color w:val="FFFFFF"/>
-                <w:sz w:val="20"/>
-                <w:szCs w:val="20"/>
-              </w:rPr>
-              <w:t xml:space="preserve">Metric</w:t>
-            </w:r>
-          </w:p>
-        </w:tc>
-        <w:tc>
-          <w:tcPr>
-            <w:tcW w:type="dxa" w:w="2400"/>
-            <w:shd w:fill="2F3C7E" w:val="clear"/>
-          </w:tcPr>
-          <w:p>
-            <w:r>
-              <w:rPr>
+                <w:color w:val="2F3C7E"/>
+                <w:sz w:val="34"/>
+                <w:szCs w:val="34"/>
+              </w:rPr>
+              <w:t xml:space="preserve">$108.76B</w:t>
+            </w:r>
+          </w:p>
+          <w:p>
+            <w:r>
+              <w:rPr>
+                <w:color w:val="6B7280"/>
+                <w:sz w:val="17"/>
+                <w:szCs w:val="17"/>
+              </w:rPr>
+              <w:t xml:space="preserve">India D2C market, 2026</w:t>
+            </w:r>
+          </w:p>
+        </w:tc>
+        <w:tc>
+          <w:tcPr>
+            <w:tcW w:type="dxa" w:w="3008"/>
+            <w:shd w:fill="F7F7F6" w:val="clear"/>
+            <w:tcMar>
+              <w:top w:type="dxa" w:w="160"/>
+              <w:left w:type="dxa" w:w="160"/>
+              <w:bottom w:type="dxa" w:w="160"/>
+              <w:right w:type="dxa" w:w="160"/>
+            </w:tcMar>
+          </w:tcPr>
+          <w:p>
+            <w:pPr>
+              <w:spacing w:after="60"/>
+            </w:pPr>
+            <w:r>
+              <w:rPr>
+                <w:rFonts w:ascii="Cambria" w:cs="Cambria" w:eastAsia="Cambria" w:hAnsi="Cambria"/>
                 <w:b/>
                 <w:bCs/>
-                <w:color w:val="FFFFFF"/>
-                <w:sz w:val="20"/>
-                <w:szCs w:val="20"/>
-              </w:rPr>
-              <w:t xml:space="preserve">Figure</w:t>
-            </w:r>
-          </w:p>
-        </w:tc>
-        <w:tc>
-          <w:tcPr>
-            <w:tcW w:type="dxa" w:w="2426"/>
-            <w:shd w:fill="2F3C7E" w:val="clear"/>
-          </w:tcPr>
-          <w:p>
-            <w:r>
-              <w:rPr>
+                <w:color w:val="2F3C7E"/>
+                <w:sz w:val="34"/>
+                <w:szCs w:val="34"/>
+              </w:rPr>
+              <w:t xml:space="preserve">24.3%</w:t>
+            </w:r>
+          </w:p>
+          <w:p>
+            <w:r>
+              <w:rPr>
+                <w:color w:val="6B7280"/>
+                <w:sz w:val="17"/>
+                <w:szCs w:val="17"/>
+              </w:rPr>
+              <w:t xml:space="preserve">CAGR through 2031</w:t>
+            </w:r>
+          </w:p>
+        </w:tc>
+        <w:tc>
+          <w:tcPr>
+            <w:tcW w:type="dxa" w:w="3008"/>
+            <w:shd w:fill="F7F7F6" w:val="clear"/>
+            <w:tcMar>
+              <w:top w:type="dxa" w:w="160"/>
+              <w:left w:type="dxa" w:w="160"/>
+              <w:bottom w:type="dxa" w:w="160"/>
+              <w:right w:type="dxa" w:w="160"/>
+            </w:tcMar>
+          </w:tcPr>
+          <w:p>
+            <w:pPr>
+              <w:spacing w:after="60"/>
+            </w:pPr>
+            <w:r>
+              <w:rPr>
+                <w:rFonts w:ascii="Cambria" w:cs="Cambria" w:eastAsia="Cambria" w:hAnsi="Cambria"/>
                 <w:b/>
                 <w:bCs/>
-                <w:color w:val="FFFFFF"/>
-                <w:sz w:val="20"/>
-                <w:szCs w:val="20"/>
-              </w:rPr>
-              <w:t xml:space="preserve">Source</w:t>
-            </w:r>
-          </w:p>
-        </w:tc>
-      </w:tr>
-      <w:tr>
-        <w:tc>
-          <w:tcPr>
-            <w:tcW w:type="dxa" w:w="4200"/>
-            <w:shd w:fill="FFFFFF" w:val="clear"/>
-          </w:tcPr>
-          <w:p>
-            <w:pPr>
-              <w:spacing w:after="60"/>
-            </w:pPr>
-            <w:r>
-              <w:rPr>
-                <w:sz w:val="20"/>
-                <w:szCs w:val="20"/>
-              </w:rPr>
-              <w:t xml:space="preserve">Global B2C ecommerce market, 2025</w:t>
-            </w:r>
-          </w:p>
-        </w:tc>
-        <w:tc>
-          <w:tcPr>
-            <w:tcW w:type="dxa" w:w="2400"/>
-            <w:shd w:fill="FFFFFF" w:val="clear"/>
-          </w:tcPr>
-          <w:p>
-            <w:pPr>
-              <w:spacing w:after="60"/>
-            </w:pPr>
-            <w:r>
-              <w:rPr>
-                <w:sz w:val="20"/>
-                <w:szCs w:val="20"/>
-              </w:rPr>
-              <w:t xml:space="preserve">$7.2 trillion</w:t>
-            </w:r>
-          </w:p>
-        </w:tc>
-        <w:tc>
-          <w:tcPr>
-            <w:tcW w:type="dxa" w:w="2426"/>
-            <w:shd w:fill="FFFFFF" w:val="clear"/>
-          </w:tcPr>
-          <w:p>
-            <w:pPr>
-              <w:spacing w:after="60"/>
-            </w:pPr>
-            <w:r>
-              <w:rPr>
-                <w:sz w:val="20"/>
-                <w:szCs w:val="20"/>
-              </w:rPr>
-              <w:t xml:space="preserve">Grand View Research [VERIFIED]</w:t>
-            </w:r>
-          </w:p>
-        </w:tc>
-      </w:tr>
-      <w:tr>
-        <w:tc>
-          <w:tcPr>
-            <w:tcW w:type="dxa" w:w="4200"/>
-            <w:shd w:fill="F7F7F6" w:val="clear"/>
-          </w:tcPr>
-          <w:p>
-            <w:pPr>
-              <w:spacing w:after="60"/>
-            </w:pPr>
-            <w:r>
-              <w:rPr>
-                <w:sz w:val="20"/>
-                <w:szCs w:val="20"/>
-              </w:rPr>
-              <w:t xml:space="preserve">Global B2C ecommerce market, 2026</w:t>
-            </w:r>
-          </w:p>
-        </w:tc>
-        <w:tc>
-          <w:tcPr>
-            <w:tcW w:type="dxa" w:w="2400"/>
-            <w:shd w:fill="F7F7F6" w:val="clear"/>
-          </w:tcPr>
-          <w:p>
-            <w:pPr>
-              <w:spacing w:after="60"/>
-            </w:pPr>
-            <w:r>
-              <w:rPr>
-                <w:sz w:val="20"/>
-                <w:szCs w:val="20"/>
-              </w:rPr>
-              <w:t xml:space="preserve">$8.5 trillion</w:t>
-            </w:r>
-          </w:p>
-        </w:tc>
-        <w:tc>
-          <w:tcPr>
-            <w:tcW w:type="dxa" w:w="2426"/>
-            <w:shd w:fill="F7F7F6" w:val="clear"/>
-          </w:tcPr>
-          <w:p>
-            <w:pPr>
-              <w:spacing w:after="60"/>
-            </w:pPr>
-            <w:r>
-              <w:rPr>
-                <w:sz w:val="20"/>
-                <w:szCs w:val="20"/>
-              </w:rPr>
-              <w:t xml:space="preserve">Grand View Research [VERIFIED]</w:t>
-            </w:r>
-          </w:p>
-        </w:tc>
-      </w:tr>
-      <w:tr>
-        <w:tc>
-          <w:tcPr>
-            <w:tcW w:type="dxa" w:w="4200"/>
-            <w:shd w:fill="FFFFFF" w:val="clear"/>
-          </w:tcPr>
-          <w:p>
-            <w:pPr>
-              <w:spacing w:after="60"/>
-            </w:pPr>
-            <w:r>
-              <w:rPr>
-                <w:sz w:val="20"/>
-                <w:szCs w:val="20"/>
-              </w:rPr>
-              <w:t xml:space="preserve">Projected by 2033</w:t>
-            </w:r>
-          </w:p>
-        </w:tc>
-        <w:tc>
-          <w:tcPr>
-            <w:tcW w:type="dxa" w:w="2400"/>
-            <w:shd w:fill="FFFFFF" w:val="clear"/>
-          </w:tcPr>
-          <w:p>
-            <w:pPr>
-              <w:spacing w:after="60"/>
-            </w:pPr>
-            <w:r>
-              <w:rPr>
-                <w:sz w:val="20"/>
-                <w:szCs w:val="20"/>
-              </w:rPr>
-              <w:t xml:space="preserve">$33.5 trillion</w:t>
-            </w:r>
-          </w:p>
-        </w:tc>
-        <w:tc>
-          <w:tcPr>
-            <w:tcW w:type="dxa" w:w="2426"/>
-            <w:shd w:fill="FFFFFF" w:val="clear"/>
-          </w:tcPr>
-          <w:p>
-            <w:pPr>
-              <w:spacing w:after="60"/>
-            </w:pPr>
-            <w:r>
-              <w:rPr>
-                <w:sz w:val="20"/>
-                <w:szCs w:val="20"/>
-              </w:rPr>
-              <w:t xml:space="preserve">Grand View Research [VERIFIED]</w:t>
-            </w:r>
-          </w:p>
-        </w:tc>
-      </w:tr>
-      <w:tr>
-        <w:tc>
-          <w:tcPr>
-            <w:tcW w:type="dxa" w:w="4200"/>
-            <w:shd w:fill="F7F7F6" w:val="clear"/>
-          </w:tcPr>
-          <w:p>
-            <w:pPr>
-              <w:spacing w:after="60"/>
-            </w:pPr>
-            <w:r>
-              <w:rPr>
-                <w:sz w:val="20"/>
-                <w:szCs w:val="20"/>
-              </w:rPr>
-              <w:t xml:space="preserve">CAGR, 2026–2033</w:t>
-            </w:r>
-          </w:p>
-        </w:tc>
-        <w:tc>
-          <w:tcPr>
-            <w:tcW w:type="dxa" w:w="2400"/>
-            <w:shd w:fill="F7F7F6" w:val="clear"/>
-          </w:tcPr>
-          <w:p>
-            <w:pPr>
-              <w:spacing w:after="60"/>
-            </w:pPr>
-            <w:r>
-              <w:rPr>
-                <w:sz w:val="20"/>
-                <w:szCs w:val="20"/>
-              </w:rPr>
-              <w:t xml:space="preserve">21.7%</w:t>
-            </w:r>
-          </w:p>
-        </w:tc>
-        <w:tc>
-          <w:tcPr>
-            <w:tcW w:type="dxa" w:w="2426"/>
-            <w:shd w:fill="F7F7F6" w:val="clear"/>
-          </w:tcPr>
-          <w:p>
-            <w:pPr>
-              <w:spacing w:after="60"/>
-            </w:pPr>
-            <w:r>
-              <w:rPr>
-                <w:sz w:val="20"/>
-                <w:szCs w:val="20"/>
-              </w:rPr>
-              <w:t xml:space="preserve">Grand View Research [VERIFIED]</w:t>
-            </w:r>
-          </w:p>
-        </w:tc>
-      </w:tr>
-      <w:tr>
-        <w:tc>
-          <w:tcPr>
-            <w:tcW w:type="dxa" w:w="4200"/>
-            <w:shd w:fill="FFFFFF" w:val="clear"/>
-          </w:tcPr>
-          <w:p>
-            <w:pPr>
-              <w:spacing w:after="60"/>
-            </w:pPr>
-            <w:r>
-              <w:rPr>
-                <w:sz w:val="20"/>
-                <w:szCs w:val="20"/>
-              </w:rPr>
-              <w:t xml:space="preserve">India D2C market, 2026 (for comparison)</w:t>
-            </w:r>
-          </w:p>
-        </w:tc>
-        <w:tc>
-          <w:tcPr>
-            <w:tcW w:type="dxa" w:w="2400"/>
-            <w:shd w:fill="FFFFFF" w:val="clear"/>
-          </w:tcPr>
-          <w:p>
-            <w:pPr>
-              <w:spacing w:after="60"/>
-            </w:pPr>
-            <w:r>
-              <w:rPr>
-                <w:sz w:val="20"/>
-                <w:szCs w:val="20"/>
-              </w:rPr>
-              <w:t xml:space="preserve">$108.76 billion</w:t>
-            </w:r>
-          </w:p>
-        </w:tc>
-        <w:tc>
-          <w:tcPr>
-            <w:tcW w:type="dxa" w:w="2426"/>
-            <w:shd w:fill="FFFFFF" w:val="clear"/>
-          </w:tcPr>
-          <w:p>
-            <w:pPr>
-              <w:spacing w:after="60"/>
-            </w:pPr>
-            <w:r>
-              <w:rPr>
-                <w:sz w:val="20"/>
-                <w:szCs w:val="20"/>
-              </w:rPr>
-              <w:t xml:space="preserve">Mordor Intelligence [VERIFIED]</w:t>
+                <w:color w:val="2F3C7E"/>
+                <w:sz w:val="34"/>
+                <w:szCs w:val="34"/>
+              </w:rPr>
+              <w:t xml:space="preserve">$322.1B</w:t>
+            </w:r>
+          </w:p>
+          <w:p>
+            <w:r>
+              <w:rPr>
+                <w:color w:val="6B7280"/>
+                <w:sz w:val="17"/>
+                <w:szCs w:val="17"/>
+              </w:rPr>
+              <w:t xml:space="preserve">Projected India market, 2031</w:t>
             </w:r>
           </w:p>
         </w:tc>
@@ -639,32 +542,181 @@
     </w:tbl>
     <w:p>
       <w:pPr>
-        <w:spacing w:after="200" w:line="300"/>
+        <w:spacing w:after="120"/>
+      </w:pPr>
+    </w:p>
+    <w:p>
+      <w:pPr>
+        <w:spacing w:after="100"/>
+      </w:pPr>
+      <w:r>
+        <w:drawing>
+          <wp:inline distT="0" distB="0" distL="0" distR="0">
+            <wp:extent cx="6035040" cy="3108960"/>
+            <wp:effectExtent t="0" r="0" b="0" l="0"/>
+            <wp:docPr id="1" name="" descr="" title=""/>
+            <wp:cNvGraphicFramePr>
+              <a:graphicFrameLocks xmlns:a="http://schemas.openxmlformats.org/drawingml/2006/main" noChangeAspect="1"/>
+            </wp:cNvGraphicFramePr>
+            <a:graphic xmlns:a="http://schemas.openxmlformats.org/drawingml/2006/main">
+              <a:graphicData uri="http://schemas.openxmlformats.org/drawingml/2006/picture">
+                <pic:pic xmlns:pic="http://schemas.openxmlformats.org/drawingml/2006/picture">
+                  <pic:nvPicPr>
+                    <pic:cNvPr id="0" name="" descr=""/>
+                    <pic:cNvPicPr>
+                      <a:picLocks noChangeAspect="1" noChangeArrowheads="1"/>
+                    </pic:cNvPicPr>
+                  </pic:nvPicPr>
+                  <pic:blipFill>
+                    <a:blip r:embed="rId7" cstate="none"/>
+                    <a:srcRect/>
+                    <a:stretch>
+                      <a:fillRect/>
+                    </a:stretch>
+                  </pic:blipFill>
+                  <pic:spPr bwMode="auto">
+                    <a:xfrm>
+                      <a:off x="0" y="0"/>
+                      <a:ext cx="6035040" cy="3108960"/>
+                    </a:xfrm>
+                    <a:prstGeom prst="rect">
+                      <a:avLst/>
+                    </a:prstGeom>
+                  </pic:spPr>
+                </pic:pic>
+              </a:graphicData>
+            </a:graphic>
+          </wp:inline>
+        </w:drawing>
+      </w:r>
+    </w:p>
+    <w:p>
+      <w:pPr>
+        <w:spacing w:after="260"/>
       </w:pPr>
       <w:r>
         <w:rPr>
           <w:i/>
           <w:iCs/>
-        </w:rPr>
-        <w:t xml:space="preserve">Important caveat, stated plainly: this is the broader B2C ecommerce figure, not a D2C-only or software-spend-only figure — Grand View Research does not isolate a separate D2C line item at this scale. Treat it as directional context for how large the market your customers would operate in is, not as a validated software-spend TAM. The same caveat that applied to the India numbers in the pre-seed deck applies here, just at a larger scale.</w:t>
+          <w:color w:val="6B7280"/>
+          <w:sz w:val="17"/>
+          <w:szCs w:val="17"/>
+        </w:rPr>
+        <w:t xml:space="preserve">Modeled from the two verified endpoints (2026, 2031) using Mordor Intelligence's 24.3% CAGR — not a year-by-year reported figure.</w:t>
+      </w:r>
+    </w:p>
+    <w:p>
+      <w:pPr>
+        <w:pStyle w:val="Heading2"/>
+        <w:spacing w:after="140" w:before="280"/>
+      </w:pPr>
+      <w:r>
+        <w:rPr>
+          <w:rFonts w:ascii="Cambria" w:cs="Cambria" w:eastAsia="Cambria" w:hAnsi="Cambria"/>
+          <w:b/>
+          <w:bCs/>
+          <w:color w:val="F96167"/>
+          <w:sz w:val="26"/>
+          <w:szCs w:val="26"/>
+        </w:rPr>
+        <w:t xml:space="preserve">3.2 Global, the category this grows into</w:t>
+      </w:r>
+    </w:p>
+    <w:p>
+      <w:pPr>
+        <w:spacing w:after="100"/>
+      </w:pPr>
+      <w:r>
+        <w:drawing>
+          <wp:inline distT="0" distB="0" distL="0" distR="0">
+            <wp:extent cx="6035040" cy="3108960"/>
+            <wp:effectExtent t="0" r="0" b="0" l="0"/>
+            <wp:docPr id="1" name="" descr="" title=""/>
+            <wp:cNvGraphicFramePr>
+              <a:graphicFrameLocks xmlns:a="http://schemas.openxmlformats.org/drawingml/2006/main" noChangeAspect="1"/>
+            </wp:cNvGraphicFramePr>
+            <a:graphic xmlns:a="http://schemas.openxmlformats.org/drawingml/2006/main">
+              <a:graphicData uri="http://schemas.openxmlformats.org/drawingml/2006/picture">
+                <pic:pic xmlns:pic="http://schemas.openxmlformats.org/drawingml/2006/picture">
+                  <pic:nvPicPr>
+                    <pic:cNvPr id="0" name="" descr=""/>
+                    <pic:cNvPicPr>
+                      <a:picLocks noChangeAspect="1" noChangeArrowheads="1"/>
+                    </pic:cNvPicPr>
+                  </pic:nvPicPr>
+                  <pic:blipFill>
+                    <a:blip r:embed="rId8" cstate="none"/>
+                    <a:srcRect/>
+                    <a:stretch>
+                      <a:fillRect/>
+                    </a:stretch>
+                  </pic:blipFill>
+                  <pic:spPr bwMode="auto">
+                    <a:xfrm>
+                      <a:off x="0" y="0"/>
+                      <a:ext cx="6035040" cy="3108960"/>
+                    </a:xfrm>
+                    <a:prstGeom prst="rect">
+                      <a:avLst/>
+                    </a:prstGeom>
+                  </pic:spPr>
+                </pic:pic>
+              </a:graphicData>
+            </a:graphic>
+          </wp:inline>
+        </w:drawing>
+      </w:r>
+    </w:p>
+    <w:p>
+      <w:pPr>
+        <w:spacing w:after="260"/>
+      </w:pPr>
+      <w:r>
+        <w:rPr>
+          <w:i/>
+          <w:iCs/>
+          <w:color w:val="6B7280"/>
+          <w:sz w:val="17"/>
+          <w:szCs w:val="17"/>
+        </w:rPr>
+        <w:t xml:space="preserve">Modeled from Grand View Research's verified 2026 ($8.5T) and 2033 ($33.5T) endpoints at a 21.7% CAGR. This is the broader B2C ecommerce figure, not a D2C-only or software-spend figure — treat as directional context, not a validated SaaS TAM.</w:t>
       </w:r>
     </w:p>
     <w:p>
       <w:pPr>
         <w:pStyle w:val="Heading1"/>
-        <w:spacing w:after="200" w:before="400"/>
-      </w:pPr>
-      <w:r>
+        <w:pBdr>
+          <w:top w:val="single" w:color="F96167" w:sz="14" w:space="8"/>
+        </w:pBdr>
+        <w:spacing w:after="40" w:before="420"/>
+      </w:pPr>
+      <w:r>
+        <w:rPr>
+          <w:rFonts w:ascii="Cambria" w:cs="Cambria" w:eastAsia="Cambria" w:hAnsi="Cambria"/>
+          <w:b/>
+          <w:bCs/>
+          <w:color w:val="2F3C7E"/>
+          <w:sz w:val="32"/>
+          <w:szCs w:val="32"/>
+        </w:rPr>
         <w:t xml:space="preserve">4. Global Competitive Landscape</w:t>
       </w:r>
     </w:p>
     <w:p>
       <w:pPr>
         <w:pStyle w:val="Heading2"/>
-        <w:spacing w:after="150" w:before="300"/>
-      </w:pPr>
-      <w:r>
-        <w:t xml:space="preserve">4.1 The established global players (unchanged from India research, now the direct competitive set)</w:t>
+        <w:spacing w:after="140" w:before="280"/>
+      </w:pPr>
+      <w:r>
+        <w:rPr>
+          <w:rFonts w:ascii="Cambria" w:cs="Cambria" w:eastAsia="Cambria" w:hAnsi="Cambria"/>
+          <w:b/>
+          <w:bCs/>
+          <w:color w:val="F96167"/>
+          <w:sz w:val="26"/>
+          <w:szCs w:val="26"/>
+        </w:rPr>
+        <w:t xml:space="preserve">4.1 The established global players</w:t>
       </w:r>
     </w:p>
     <w:tbl>
@@ -693,6 +745,7 @@
           <w:tcPr>
             <w:tcW w:type="dxa" w:w="1600"/>
             <w:shd w:fill="2F3C7E" w:val="clear"/>
+            <w:vAlign w:val="center"/>
           </w:tcPr>
           <w:p>
             <w:r>
@@ -711,6 +764,7 @@
           <w:tcPr>
             <w:tcW w:type="dxa" w:w="3000"/>
             <w:shd w:fill="2F3C7E" w:val="clear"/>
+            <w:vAlign w:val="center"/>
           </w:tcPr>
           <w:p>
             <w:r>
@@ -729,6 +783,7 @@
           <w:tcPr>
             <w:tcW w:type="dxa" w:w="2126"/>
             <w:shd w:fill="2F3C7E" w:val="clear"/>
+            <w:vAlign w:val="center"/>
           </w:tcPr>
           <w:p>
             <w:r>
@@ -747,6 +802,7 @@
           <w:tcPr>
             <w:tcW w:type="dxa" w:w="2300"/>
             <w:shd w:fill="2F3C7E" w:val="clear"/>
+            <w:vAlign w:val="center"/>
           </w:tcPr>
           <w:p>
             <w:r>
@@ -831,7 +887,7 @@
                 <w:sz w:val="20"/>
                 <w:szCs w:val="20"/>
               </w:rPr>
-              <w:t xml:space="preserve">Multi-currency confirmed [VERIFIED] via own help docs</w:t>
+              <w:t xml:space="preserve">Multi-currency confirmed [VERIFIED]</w:t>
             </w:r>
           </w:p>
         </w:tc>
@@ -905,7 +961,7 @@
                 <w:sz w:val="20"/>
                 <w:szCs w:val="20"/>
               </w:rPr>
-              <w:t xml:space="preserve">Not confirmed either way [gap]</w:t>
+              <w:t xml:space="preserve">Not confirmed either way</w:t>
             </w:r>
           </w:p>
         </w:tc>
@@ -979,7 +1035,7 @@
                 <w:sz w:val="20"/>
                 <w:szCs w:val="20"/>
               </w:rPr>
-              <w:t xml:space="preserve">Not confirmed either way [gap]</w:t>
+              <w:t xml:space="preserve">Not confirmed either way</w:t>
             </w:r>
           </w:p>
         </w:tc>
@@ -1053,7 +1109,7 @@
                 <w:sz w:val="20"/>
                 <w:szCs w:val="20"/>
               </w:rPr>
-              <w:t xml:space="preserve">Not confirmed either way [gap]</w:t>
+              <w:t xml:space="preserve">Not confirmed either way</w:t>
             </w:r>
           </w:p>
         </w:tc>
@@ -1127,7 +1183,7 @@
                 <w:sz w:val="20"/>
                 <w:szCs w:val="20"/>
               </w:rPr>
-              <w:t xml:space="preserve">Not confirmed either way [gap]</w:t>
+              <w:t xml:space="preserve">Not confirmed either way</w:t>
             </w:r>
           </w:p>
         </w:tc>
@@ -1201,7 +1257,7 @@
                 <w:sz w:val="20"/>
                 <w:szCs w:val="20"/>
               </w:rPr>
-              <w:t xml:space="preserve">Not confirmed either way [gap]</w:t>
+              <w:t xml:space="preserve">Not confirmed either way</w:t>
             </w:r>
           </w:p>
         </w:tc>
@@ -1349,7 +1405,7 @@
                 <w:sz w:val="20"/>
                 <w:szCs w:val="20"/>
               </w:rPr>
-              <w:t xml:space="preserve">Claims native Razorpay; inconsistent with own pricing page [flagged]</w:t>
+              <w:t xml:space="preserve">Claims native Razorpay; inconsistent with own pricing [flagged]</w:t>
             </w:r>
           </w:p>
         </w:tc>
@@ -1358,94 +1414,124 @@
     <w:p>
       <w:pPr>
         <w:pStyle w:val="Heading2"/>
-        <w:spacing w:after="150" w:before="300"/>
-      </w:pPr>
-      <w:r>
-        <w:t xml:space="preserve">4.2 Regional coverage check — Southeast Asia, Latin America, Europe, Middle East</w:t>
-      </w:r>
-    </w:p>
-    <w:p>
-      <w:pPr>
-        <w:spacing w:after="200" w:line="300"/>
-      </w:pPr>
-      <w:r>
-        <w:rPr>
-          <w:b/>
-          <w:bCs/>
-          <w:color w:val="1A7A3C"/>
-          <w:sz w:val="18"/>
-          <w:szCs w:val="18"/>
-        </w:rPr>
-        <w:t xml:space="preserve"> [VERIFIED] </w:t>
-      </w:r>
-      <w:r>
-        <w:rPr>
-          <w:sz w:val="22"/>
-          <w:szCs w:val="22"/>
-        </w:rPr>
-        <w:t xml:space="preserve">Southeast Asia: Plugo (Singapore) is a real, funded company — $9M Series A led by Altos Ventures, December 2022 (DealStreetAsia, TechCrunch, Tracxn). It is an ecommerce enabler (storefront + fulfillment, some analytics) rather than a pure unified-analytics dashboard — an adjacent reference point, not a head-to-head competitor.</w:t>
-      </w:r>
-    </w:p>
-    <w:p>
-      <w:pPr>
-        <w:spacing w:after="200" w:line="300"/>
-      </w:pPr>
-      <w:r>
-        <w:rPr>
+        <w:spacing w:after="140" w:before="280"/>
+      </w:pPr>
+      <w:r>
+        <w:rPr>
+          <w:rFonts w:ascii="Cambria" w:cs="Cambria" w:eastAsia="Cambria" w:hAnsi="Cambria"/>
           <w:b/>
           <w:bCs/>
           <w:color w:val="F96167"/>
-          <w:sz w:val="18"/>
-          <w:szCs w:val="18"/>
-        </w:rPr>
-        <w:t xml:space="preserve"> [HONEST GAP] </w:t>
+          <w:sz w:val="26"/>
+          <w:szCs w:val="26"/>
+        </w:rPr>
+        <w:t xml:space="preserve">4.2 Regional coverage check</w:t>
+      </w:r>
+    </w:p>
+    <w:p>
+      <w:pPr>
+        <w:spacing w:after="200" w:line="300"/>
+      </w:pPr>
+      <w:r>
+        <w:rPr>
+          <w:b/>
+          <w:bCs/>
+          <w:color w:val="FFFFFF"/>
+          <w:sz w:val="17"/>
+          <w:szCs w:val="17"/>
+          <w:shd w:fill="1A7A3C" w:val="clear"/>
+        </w:rPr>
+        <w:t xml:space="preserve"> VERIFIED </w:t>
       </w:r>
       <w:r>
         <w:rPr>
           <w:sz w:val="22"/>
           <w:szCs w:val="22"/>
         </w:rPr>
-        <w:t xml:space="preserve">Latin America: no dedicated D2C-brand-facing unified analytics startup was found. Europe (UK/Germany/France): none found. Middle East: none found. Read this correctly — absence of evidence is not evidence of an empty, winnable market. It may equally mean the market is under-documented in English-language search, or that demand is genuinely smaller there. This needs direct, local research before being treated as "open territory."</w:t>
+        <w:t xml:space="preserve">  Southeast Asia: Plugo (Singapore) is real and funded — $9M Series A led by Altos Ventures, Dec 2022 (DealStreetAsia, TechCrunch, Tracxn). It's an ecommerce enabler (storefront + fulfillment, some analytics), not a pure analytics dashboard — adjacent, not head-to-head.</w:t>
+      </w:r>
+    </w:p>
+    <w:p>
+      <w:pPr>
+        <w:spacing w:after="200" w:line="300"/>
+      </w:pPr>
+      <w:r>
+        <w:rPr>
+          <w:b/>
+          <w:bCs/>
+          <w:color w:val="FFFFFF"/>
+          <w:sz w:val="17"/>
+          <w:szCs w:val="17"/>
+          <w:shd w:fill="F96167" w:val="clear"/>
+        </w:rPr>
+        <w:t xml:space="preserve"> HONEST GAP </w:t>
+      </w:r>
+      <w:r>
+        <w:rPr>
+          <w:sz w:val="22"/>
+          <w:szCs w:val="22"/>
+        </w:rPr>
+        <w:t xml:space="preserve">  Latin America, Europe (UK/Germany/France), Middle East: no dedicated D2C analytics competitor found. Absence of evidence is not evidence of an empty, winnable market — it may mean under-documented markets, not open ones. Needs direct local research before being treated as "open territory."</w:t>
       </w:r>
     </w:p>
     <w:p>
       <w:pPr>
         <w:pStyle w:val="Heading1"/>
-        <w:spacing w:after="200" w:before="400"/>
-      </w:pPr>
-      <w:r>
+        <w:pBdr>
+          <w:top w:val="single" w:color="F96167" w:sz="14" w:space="8"/>
+        </w:pBdr>
+        <w:spacing w:after="40" w:before="420"/>
+      </w:pPr>
+      <w:r>
+        <w:rPr>
+          <w:rFonts w:ascii="Cambria" w:cs="Cambria" w:eastAsia="Cambria" w:hAnsi="Cambria"/>
+          <w:b/>
+          <w:bCs/>
+          <w:color w:val="2F3C7E"/>
+          <w:sz w:val="32"/>
+          <w:szCs w:val="32"/>
+        </w:rPr>
         <w:t xml:space="preserve">5. Recommended Feature Set — Claude's Own Suggestions</w:t>
       </w:r>
     </w:p>
     <w:p>
       <w:pPr>
-        <w:spacing w:after="250" w:line="300"/>
-      </w:pPr>
-      <w:r>
-        <w:rPr>
+        <w:spacing w:after="200" w:line="300"/>
+      </w:pPr>
+      <w:r>
+        <w:rPr>
+          <w:b/>
+          <w:bCs/>
+          <w:color w:val="FFFFFF"/>
+          <w:sz w:val="17"/>
+          <w:szCs w:val="17"/>
+          <w:shd w:fill="F96167" w:val="clear"/>
+        </w:rPr>
+        <w:t xml:space="preserve"> INFERENCE </w:t>
+      </w:r>
+      <w:r>
+        <w:rPr>
+          <w:sz w:val="22"/>
+          <w:szCs w:val="22"/>
+        </w:rPr>
+        <w:t xml:space="preserve">  Everything below is my own product judgment on what makes analytics/BI tools genuinely sticky — none of it is user-validated. Treat this as a prioritization menu for real founder conversations, not a committed roadmap.</w:t>
+      </w:r>
+    </w:p>
+    <w:p>
+      <w:pPr>
+        <w:pStyle w:val="Heading2"/>
+        <w:spacing w:after="140" w:before="280"/>
+      </w:pPr>
+      <w:r>
+        <w:rPr>
+          <w:rFonts w:ascii="Cambria" w:cs="Cambria" w:eastAsia="Cambria" w:hAnsi="Cambria"/>
           <w:b/>
           <w:bCs/>
           <w:color w:val="F96167"/>
-          <w:sz w:val="18"/>
-          <w:szCs w:val="18"/>
-        </w:rPr>
-        <w:t xml:space="preserve"> [INFERENCE] </w:t>
-      </w:r>
-      <w:r>
-        <w:rPr>
-          <w:sz w:val="22"/>
-          <w:szCs w:val="22"/>
-        </w:rPr>
-        <w:t xml:space="preserve">Everything in this section is my own product judgment, based on what tends to make analytics/BI tools genuinely sticky — none of it is user-validated or requested by any researched customer. Treat this as a brainstorm to react to and prioritize with real founders, not a committed roadmap.</w:t>
-      </w:r>
-    </w:p>
-    <w:p>
-      <w:pPr>
-        <w:pStyle w:val="Heading2"/>
-        <w:spacing w:after="150" w:before="300"/>
-      </w:pPr>
-      <w:r>
-        <w:t xml:space="preserve">5.1 Intelligence layer — what makes the "AI" part actually worth paying for</w:t>
+          <w:sz w:val="26"/>
+          <w:szCs w:val="26"/>
+        </w:rPr>
+        <w:t xml:space="preserve">5.1 Intelligence layer</w:t>
       </w:r>
     </w:p>
     <w:p>
@@ -1458,7 +1544,7 @@
         <w:spacing w:after="120" w:line="280"/>
       </w:pPr>
       <w:r>
-        <w:t xml:space="preserve">Natural-language copilot: let a founder type or speak a question ("why did CAC spike Tuesday") and get an answer, not just browse pre-built charts — this is the single feature most likely to make non-technical founders feel the product is doing something for them, not just displaying data.</w:t>
+        <w:t xml:space="preserve">Natural-language copilot — ask a question ("why did CAC spike Tuesday"), get an answer, not another chart. Most likely single feature to make the product feel alive to non-technical founders.</w:t>
       </w:r>
     </w:p>
     <w:p>
@@ -1471,7 +1557,7 @@
         <w:spacing w:after="120" w:line="280"/>
       </w:pPr>
       <w:r>
-        <w:t xml:space="preserve">Proactive anomaly alerts pushed to WhatsApp, Slack, or email — the product should tell you something is wrong before you open the dashboard, not wait for you to notice a dip yourself.</w:t>
+        <w:t xml:space="preserve">Proactive anomaly alerts pushed to WhatsApp, Slack, or email — the product should flag problems before you notice them yourself.</w:t>
       </w:r>
     </w:p>
     <w:p>
@@ -1484,7 +1570,7 @@
         <w:spacing w:after="120" w:line="280"/>
       </w:pPr>
       <w:r>
-        <w:t xml:space="preserve">Forecasting: near-term revenue, inventory stockout risk, and CAC trend projections — turns the tool from a rear-view mirror into something forward-looking.</w:t>
+        <w:t xml:space="preserve">Forecasting — near-term revenue, inventory stockout risk, CAC trend projections.</w:t>
       </w:r>
     </w:p>
     <w:p>
@@ -1497,15 +1583,23 @@
         <w:spacing w:after="120" w:line="280"/>
       </w:pPr>
       <w:r>
-        <w:t xml:space="preserve">Anonymized industry benchmarking ("your CAC is 18% above similar-sized brands in your category") — this is a genuinely hard data-moat feature to copy once you have enough customers, and a strong reason to stay subscribed.</w:t>
+        <w:t xml:space="preserve">Anonymized industry benchmarking — a genuinely hard-to-copy data moat once you have enough customers.</w:t>
       </w:r>
     </w:p>
     <w:p>
       <w:pPr>
         <w:pStyle w:val="Heading2"/>
-        <w:spacing w:after="150" w:before="300"/>
-      </w:pPr>
-      <w:r>
+        <w:spacing w:after="140" w:before="280"/>
+      </w:pPr>
+      <w:r>
+        <w:rPr>
+          <w:rFonts w:ascii="Cambria" w:cs="Cambria" w:eastAsia="Cambria" w:hAnsi="Cambria"/>
+          <w:b/>
+          <w:bCs/>
+          <w:color w:val="F96167"/>
+          <w:sz w:val="26"/>
+          <w:szCs w:val="26"/>
+        </w:rPr>
         <w:t xml:space="preserve">5.2 Growth &amp; marketing depth</w:t>
       </w:r>
     </w:p>
@@ -1519,7 +1613,7 @@
         <w:spacing w:after="120" w:line="280"/>
       </w:pPr>
       <w:r>
-        <w:t xml:space="preserve">Creative fatigue detection — flag when a specific ad creative's performance is declining, tied to spend recommendations.</w:t>
+        <w:t xml:space="preserve">Creative fatigue detection tied to spend recommendations.</w:t>
       </w:r>
     </w:p>
     <w:p>
@@ -1532,7 +1626,7 @@
         <w:spacing w:after="120" w:line="280"/>
       </w:pPr>
       <w:r>
-        <w:t xml:space="preserve">Cohort and RFM (recency/frequency/monetary) segmentation with retention curves — critical for any brand with repeat-purchase or subscription revenue.</w:t>
+        <w:t xml:space="preserve">Cohort and RFM segmentation with retention curves — critical for repeat-purchase or subscription brands.</w:t>
       </w:r>
     </w:p>
     <w:p>
@@ -1545,7 +1639,7 @@
         <w:spacing w:after="120" w:line="280"/>
       </w:pPr>
       <w:r>
-        <w:t xml:space="preserve">Influencer and affiliate ROI tracking — a growing spend category for D2C brands that's poorly served by pure ad-attribution tools.</w:t>
+        <w:t xml:space="preserve">Influencer and affiliate ROI tracking — a growing, poorly-served spend category.</w:t>
       </w:r>
     </w:p>
     <w:p>
@@ -1558,15 +1652,23 @@
         <w:spacing w:after="120" w:line="280"/>
       </w:pPr>
       <w:r>
-        <w:t xml:space="preserve">Social commerce unification — TikTok Shop, Instagram Shop, Facebook Shop revenue and funnel data in the same view as paid ads.</w:t>
+        <w:t xml:space="preserve">Social commerce unification — TikTok Shop, Instagram Shop, Facebook Shop in one funnel view.</w:t>
       </w:r>
     </w:p>
     <w:p>
       <w:pPr>
         <w:pStyle w:val="Heading2"/>
-        <w:spacing w:after="150" w:before="300"/>
-      </w:pPr>
-      <w:r>
+        <w:spacing w:after="140" w:before="280"/>
+      </w:pPr>
+      <w:r>
+        <w:rPr>
+          <w:rFonts w:ascii="Cambria" w:cs="Cambria" w:eastAsia="Cambria" w:hAnsi="Cambria"/>
+          <w:b/>
+          <w:bCs/>
+          <w:color w:val="F96167"/>
+          <w:sz w:val="26"/>
+          <w:szCs w:val="26"/>
+        </w:rPr>
         <w:t xml:space="preserve">5.3 Operations &amp; trust</w:t>
       </w:r>
     </w:p>
@@ -1580,7 +1682,7 @@
         <w:spacing w:after="120" w:line="280"/>
       </w:pPr>
       <w:r>
-        <w:t xml:space="preserve">Root-cause RTO/return/chargeback analysis — extending the India-specific RTO idea into a general "why are we losing money on fulfillment" feature that travels well to any market with cash-on-delivery or high-return-rate categories.</w:t>
+        <w:t xml:space="preserve">Root-cause RTO/return/chargeback analysis — the India RTO idea generalized to any high-COD or high-return category.</w:t>
       </w:r>
     </w:p>
     <w:p>
@@ -1593,7 +1695,7 @@
         <w:spacing w:after="120" w:line="280"/>
       </w:pPr>
       <w:r>
-        <w:t xml:space="preserve">Customer 360 view — merge on-site behavior, WhatsApp/email conversations, and support tickets into one customer timeline, not just transaction history.</w:t>
+        <w:t xml:space="preserve">Customer 360 view — on-site behavior, WhatsApp/email, and support tickets in one timeline.</w:t>
       </w:r>
     </w:p>
     <w:p>
@@ -1606,16 +1708,24 @@
         <w:spacing w:after="120" w:line="280"/>
       </w:pPr>
       <w:r>
-        <w:t xml:space="preserve">Auto-generated weekly "board report" export (PDF or slide format) — saves founders the manual work of building a report for investors or co-founders.</w:t>
+        <w:t xml:space="preserve">Auto-generated weekly board report export (PDF/slide) — saves manual reporting work.</w:t>
       </w:r>
     </w:p>
     <w:p>
       <w:pPr>
         <w:pStyle w:val="Heading2"/>
-        <w:spacing w:after="150" w:before="300"/>
-      </w:pPr>
-      <w:r>
-        <w:t xml:space="preserve">5.4 Scale &amp; collaboration (aimed at agencies and multi-brand operators)</w:t>
+        <w:spacing w:after="140" w:before="280"/>
+      </w:pPr>
+      <w:r>
+        <w:rPr>
+          <w:rFonts w:ascii="Cambria" w:cs="Cambria" w:eastAsia="Cambria" w:hAnsi="Cambria"/>
+          <w:b/>
+          <w:bCs/>
+          <w:color w:val="F96167"/>
+          <w:sz w:val="26"/>
+          <w:szCs w:val="26"/>
+        </w:rPr>
+        <w:t xml:space="preserve">5.4 Scale &amp; collaboration</w:t>
       </w:r>
     </w:p>
     <w:p>
@@ -1628,7 +1738,7 @@
         <w:spacing w:after="120" w:line="280"/>
       </w:pPr>
       <w:r>
-        <w:t xml:space="preserve">Multi-brand/multi-store rollup view — useful for founders running more than one D2C brand, or agencies managing several clients.</w:t>
+        <w:t xml:space="preserve">Multi-brand/multi-store rollup for founders or agencies running more than one brand.</w:t>
       </w:r>
     </w:p>
     <w:p>
@@ -1641,7 +1751,7 @@
         <w:spacing w:after="120" w:line="280"/>
       </w:pPr>
       <w:r>
-        <w:t xml:space="preserve">White-label reporting export — lets marketing agencies use the tool for client reporting under their own brand, opening an entirely different sales channel (agencies, not just individual brands).</w:t>
+        <w:t xml:space="preserve">White-label reporting — opens agencies as an entirely separate sales channel.</w:t>
       </w:r>
     </w:p>
     <w:p>
@@ -1654,16 +1764,7 @@
         <w:spacing w:after="120" w:line="280"/>
       </w:pPr>
       <w:r>
-        <w:t xml:space="preserve">Data warehouse export / API access — for larger customers who want to pipe the underlying data into their own BI stack rather than being locked into the dashboard.</w:t>
-      </w:r>
-    </w:p>
-    <w:p>
-      <w:pPr>
-        <w:pStyle w:val="Heading2"/>
-        <w:spacing w:after="150" w:before="300"/>
-      </w:pPr>
-      <w:r>
-        <w:t xml:space="preserve">5.5 A note on sequencing</w:t>
+        <w:t xml:space="preserve">Data warehouse export / API access for larger customers who want their own BI stack.</w:t>
       </w:r>
     </w:p>
     <w:p>
@@ -1674,43 +1775,40 @@
         <w:rPr>
           <w:i/>
           <w:iCs/>
-        </w:rPr>
-        <w:t xml:space="preserve">Building all of this before validating demand would be a mistake — this list is deliberately long so you have options to prioritize with real customers, not a checklist to build blind. The single highest-leverage feature to prototype first, based on what makes competitors' reviewers rave (Polar Analytics' G2 reviews specifically praise plain-language insight), is probably the natural-language copilot — it's the most visible, demoable difference from "just another dashboard."</w:t>
+          <w:color w:val="1B1F3B"/>
+        </w:rPr>
+        <w:t xml:space="preserve">Highest-leverage feature to prototype first: the natural-language copilot — the most visible, demoable difference from "just another dashboard," and the exact thing Polar Analytics' own reviewers praise.</w:t>
       </w:r>
     </w:p>
     <w:p>
       <w:pPr>
         <w:pStyle w:val="Heading1"/>
-        <w:spacing w:after="200" w:before="400"/>
-      </w:pPr>
-      <w:r>
+        <w:pBdr>
+          <w:top w:val="single" w:color="F96167" w:sz="14" w:space="8"/>
+        </w:pBdr>
+        <w:spacing w:after="40" w:before="420"/>
+      </w:pPr>
+      <w:r>
+        <w:rPr>
+          <w:rFonts w:ascii="Cambria" w:cs="Cambria" w:eastAsia="Cambria" w:hAnsi="Cambria"/>
+          <w:b/>
+          <w:bCs/>
+          <w:color w:val="2F3C7E"/>
+          <w:sz w:val="32"/>
+          <w:szCs w:val="32"/>
+        </w:rPr>
         <w:t xml:space="preserve">6. Business Model &amp; Go-To-Market at Global Scale</w:t>
       </w:r>
     </w:p>
     <w:p>
       <w:pPr>
-        <w:pStyle w:val="Heading2"/>
-        <w:spacing w:after="150" w:before="300"/>
-      </w:pPr>
-      <w:r>
-        <w:t xml:space="preserve">6.1 Pricing</w:t>
-      </w:r>
-    </w:p>
-    <w:p>
-      <w:pPr>
         <w:spacing w:after="200" w:line="300"/>
       </w:pPr>
       <w:r>
-        <w:t xml:space="preserve">The India-first pricing in the pre-seed deck ($50–$300/month) was benchmarked against Triple Whale and Putler's real published tiers. At global scale, that same benchmark still roughly holds — Triple Whale's real range is $124–$375+/month — but multi-currency billing, regional payment processing (Stripe vs. Razorpay vs. Mercado Pago vs. GrabPay), and regional tax/VAT handling become real engineering and legal costs that don't exist in an India-only version.</w:t>
-      </w:r>
-    </w:p>
-    <w:p>
-      <w:pPr>
-        <w:pStyle w:val="Heading2"/>
-        <w:spacing w:after="150" w:before="300"/>
-      </w:pPr>
-      <w:r>
-        <w:t xml:space="preserve">6.2 Go-to-market</w:t>
+        <w:rPr>
+          <w:color w:val="1B1F3B"/>
+        </w:rPr>
+        <w:t xml:space="preserve">The India-first pricing ($50–$300/month) was benchmarked against Triple Whale and Putler's real published tiers, and roughly holds globally — but multi-currency billing, regional payment processing (Stripe vs. Razorpay vs. Mercado Pago vs. GrabPay), and regional tax/VAT handling become real engineering and legal costs that don't exist in an India-only version.</w:t>
       </w:r>
     </w:p>
     <w:p>
@@ -1718,15 +1816,29 @@
         <w:spacing w:after="200" w:line="300"/>
       </w:pPr>
       <w:r>
-        <w:t xml:space="preserve">A global launch has no natural "first community" to reach through founder networks the way an India-first launch does through Indian D2C founder groups. Realistic global channels: Shopify App Store listing (works globally by default, no extra cost), content/SEO targeting specific pain points ("Shopify analytics for [country]"), and — if the emerging-market wedge hypothesis in Section 2.3 holds — repeating the same direct-founder-outreach playbook market by market, not all at once.</w:t>
+        <w:rPr>
+          <w:color w:val="1B1F3B"/>
+        </w:rPr>
+        <w:t xml:space="preserve">A global launch has no natural "first community" the way India-first has Indian D2C founder groups. Realistic global channels: Shopify App Store (global by default), SEO targeting country-specific pain points, and — if the emerging-market hypothesis in 2.3 holds — repeating the direct-founder-outreach playbook market by market.</w:t>
       </w:r>
     </w:p>
     <w:p>
       <w:pPr>
         <w:pStyle w:val="Heading1"/>
-        <w:spacing w:after="200" w:before="400"/>
-      </w:pPr>
-      <w:r>
+        <w:pBdr>
+          <w:top w:val="single" w:color="F96167" w:sz="14" w:space="8"/>
+        </w:pBdr>
+        <w:spacing w:after="40" w:before="420"/>
+      </w:pPr>
+      <w:r>
+        <w:rPr>
+          <w:rFonts w:ascii="Cambria" w:cs="Cambria" w:eastAsia="Cambria" w:hAnsi="Cambria"/>
+          <w:b/>
+          <w:bCs/>
+          <w:color w:val="2F3C7E"/>
+          <w:sz w:val="32"/>
+          <w:szCs w:val="32"/>
+        </w:rPr>
         <w:t xml:space="preserve">7. Risk Register — Global Scope</w:t>
       </w:r>
     </w:p>
@@ -1755,6 +1867,7 @@
           <w:tcPr>
             <w:tcW w:type="dxa" w:w="2200"/>
             <w:shd w:fill="2F3C7E" w:val="clear"/>
+            <w:vAlign w:val="center"/>
           </w:tcPr>
           <w:p>
             <w:r>
@@ -1773,6 +1886,7 @@
           <w:tcPr>
             <w:tcW w:type="dxa" w:w="3200"/>
             <w:shd w:fill="2F3C7E" w:val="clear"/>
+            <w:vAlign w:val="center"/>
           </w:tcPr>
           <w:p>
             <w:r>
@@ -1791,6 +1905,7 @@
           <w:tcPr>
             <w:tcW w:type="dxa" w:w="3626"/>
             <w:shd w:fill="2F3C7E" w:val="clear"/>
+            <w:vAlign w:val="center"/>
           </w:tcPr>
           <w:p>
             <w:r>
@@ -1857,7 +1972,7 @@
                 <w:sz w:val="20"/>
                 <w:szCs w:val="20"/>
               </w:rPr>
-              <w:t xml:space="preserve">Validate the emerging-market-payment-gap hypothesis directly before committing to "global" positioning</w:t>
+              <w:t xml:space="preserve">Validate the emerging-market-payment-gap hypothesis directly before positioning as "global"</w:t>
             </w:r>
           </w:p>
         </w:tc>
@@ -1913,7 +2028,7 @@
                 <w:sz w:val="20"/>
                 <w:szCs w:val="20"/>
               </w:rPr>
-              <w:t xml:space="preserve">Pick a specific underserved segment (region, vertical, or workflow) rather than "everyone, everywhere"</w:t>
+              <w:t xml:space="preserve">Pick a specific underserved segment rather than "everyone, everywhere"</w:t>
             </w:r>
           </w:p>
         </w:tc>
@@ -1951,7 +2066,7 @@
                 <w:sz w:val="20"/>
                 <w:szCs w:val="20"/>
               </w:rPr>
-              <w:t xml:space="preserve">GDPR, CCPA, LGPD, and others apply simultaneously</w:t>
+              <w:t xml:space="preserve">GDPR, CCPA, LGPD apply simultaneously</w:t>
             </w:r>
           </w:p>
         </w:tc>
@@ -1969,7 +2084,7 @@
                 <w:sz w:val="20"/>
                 <w:szCs w:val="20"/>
               </w:rPr>
-              <w:t xml:space="preserve">Sequence market entry so compliance work is incremental, not all at once</w:t>
+              <w:t xml:space="preserve">Sequence market entry so compliance work is incremental</w:t>
             </w:r>
           </w:p>
         </w:tc>
@@ -2081,7 +2196,7 @@
                 <w:sz w:val="20"/>
                 <w:szCs w:val="20"/>
               </w:rPr>
-              <w:t xml:space="preserve">Fall back to a market-by-market repeat of the India playbook rather than a simultaneous global launch</w:t>
+              <w:t xml:space="preserve">Fall back to a market-by-market repeat of the India playbook</w:t>
             </w:r>
           </w:p>
         </w:tc>
@@ -2090,32 +2205,498 @@
     <w:p>
       <w:pPr>
         <w:pStyle w:val="Heading1"/>
-        <w:spacing w:after="200" w:before="400"/>
-      </w:pPr>
-      <w:r>
-        <w:t xml:space="preserve">8. Bottom Line</w:t>
-      </w:r>
-    </w:p>
-    <w:p>
-      <w:pPr>
-        <w:spacing w:after="200" w:line="300"/>
-      </w:pPr>
-      <w:r>
-        <w:rPr>
+        <w:pBdr>
+          <w:top w:val="single" w:color="F96167" w:sz="14" w:space="8"/>
+        </w:pBdr>
+        <w:spacing w:after="40" w:before="420"/>
+      </w:pPr>
+      <w:r>
+        <w:rPr>
+          <w:rFonts w:ascii="Cambria" w:cs="Cambria" w:eastAsia="Cambria" w:hAnsi="Cambria"/>
           <w:b/>
           <w:bCs/>
-          <w:color w:val="F96167"/>
-          <w:sz w:val="18"/>
-          <w:szCs w:val="18"/>
-        </w:rPr>
-        <w:t xml:space="preserve"> [INFERENCE] </w:t>
+          <w:color w:val="2F3C7E"/>
+          <w:sz w:val="32"/>
+          <w:szCs w:val="32"/>
+        </w:rPr>
+        <w:t xml:space="preserve">8. The Phased Plan — India Immersion First</w:t>
+      </w:r>
+    </w:p>
+    <w:p>
+      <w:pPr>
+        <w:spacing w:after="200" w:line="300"/>
+      </w:pPr>
+      <w:r>
+        <w:rPr>
+          <w:color w:val="1B1F3B"/>
+        </w:rPr>
+        <w:t xml:space="preserve">This is the answer to "what do I actually do": prove the India wedge completely before spending a single dollar on global positioning. The table below is the same roadmap used in the pitch deck — phases 01–02 are what a pre-seed raise funds; 03–05 are the vision that path validates, not something being asked for today.</w:t>
+      </w:r>
+    </w:p>
+    <w:tbl>
+      <w:tblPr>
+        <w:tblW w:type="dxa" w:w="9026"/>
+        <w:tblBorders>
+          <w:top w:val="single" w:color="auto" w:sz="4"/>
+          <w:left w:val="single" w:color="auto" w:sz="4"/>
+          <w:bottom w:val="single" w:color="auto" w:sz="4"/>
+          <w:right w:val="single" w:color="auto" w:sz="4"/>
+          <w:insideH w:val="single" w:color="auto" w:sz="4"/>
+          <w:insideV w:val="single" w:color="auto" w:sz="4"/>
+        </w:tblBorders>
+      </w:tblPr>
+      <w:tblGrid>
+        <w:gridCol w:w="1805"/>
+        <w:gridCol w:w="1805"/>
+        <w:gridCol w:w="1805"/>
+        <w:gridCol w:w="1805"/>
+        <w:gridCol w:w="1805"/>
+      </w:tblGrid>
+      <w:tr>
+        <w:tc>
+          <w:tcPr>
+            <w:tcW w:type="dxa" w:w="1805"/>
+            <w:shd w:fill="F96167" w:val="clear"/>
+            <w:tcMar>
+              <w:top w:type="dxa" w:w="120"/>
+              <w:left w:type="dxa" w:w="140"/>
+              <w:bottom w:type="dxa" w:w="100"/>
+              <w:right w:type="dxa" w:w="140"/>
+            </w:tcMar>
+          </w:tcPr>
+          <w:p>
+            <w:r>
+              <w:rPr>
+                <w:b/>
+                <w:bCs/>
+                <w:color w:val="FFFFFF"/>
+                <w:sz w:val="19"/>
+                <w:szCs w:val="19"/>
+              </w:rPr>
+              <w:t xml:space="preserve">01 · Validate</w:t>
+            </w:r>
+          </w:p>
+        </w:tc>
+        <w:tc>
+          <w:tcPr>
+            <w:tcW w:type="dxa" w:w="1805"/>
+            <w:shd w:fill="F96167" w:val="clear"/>
+            <w:tcMar>
+              <w:top w:type="dxa" w:w="120"/>
+              <w:left w:type="dxa" w:w="140"/>
+              <w:bottom w:type="dxa" w:w="100"/>
+              <w:right w:type="dxa" w:w="140"/>
+            </w:tcMar>
+          </w:tcPr>
+          <w:p>
+            <w:r>
+              <w:rPr>
+                <w:b/>
+                <w:bCs/>
+                <w:color w:val="FFFFFF"/>
+                <w:sz w:val="19"/>
+                <w:szCs w:val="19"/>
+              </w:rPr>
+              <w:t xml:space="preserve">02 · India MVP</w:t>
+            </w:r>
+          </w:p>
+        </w:tc>
+        <w:tc>
+          <w:tcPr>
+            <w:tcW w:type="dxa" w:w="1805"/>
+            <w:shd w:fill="2F3C7E" w:val="clear"/>
+            <w:tcMar>
+              <w:top w:type="dxa" w:w="120"/>
+              <w:left w:type="dxa" w:w="140"/>
+              <w:bottom w:type="dxa" w:w="100"/>
+              <w:right w:type="dxa" w:w="140"/>
+            </w:tcMar>
+          </w:tcPr>
+          <w:p>
+            <w:r>
+              <w:rPr>
+                <w:b/>
+                <w:bCs/>
+                <w:color w:val="FFFFFF"/>
+                <w:sz w:val="19"/>
+                <w:szCs w:val="19"/>
+              </w:rPr>
+              <w:t xml:space="preserve">03 · India Scale</w:t>
+            </w:r>
+          </w:p>
+        </w:tc>
+        <w:tc>
+          <w:tcPr>
+            <w:tcW w:type="dxa" w:w="1805"/>
+            <w:shd w:fill="2F3C7E" w:val="clear"/>
+            <w:tcMar>
+              <w:top w:type="dxa" w:w="120"/>
+              <w:left w:type="dxa" w:w="140"/>
+              <w:bottom w:type="dxa" w:w="100"/>
+              <w:right w:type="dxa" w:w="140"/>
+            </w:tcMar>
+          </w:tcPr>
+          <w:p>
+            <w:r>
+              <w:rPr>
+                <w:b/>
+                <w:bCs/>
+                <w:color w:val="FFFFFF"/>
+                <w:sz w:val="19"/>
+                <w:szCs w:val="19"/>
+              </w:rPr>
+              <w:t xml:space="preserve">04 · 1st Adjacent Market</w:t>
+            </w:r>
+          </w:p>
+        </w:tc>
+        <w:tc>
+          <w:tcPr>
+            <w:tcW w:type="dxa" w:w="1805"/>
+            <w:shd w:fill="2F3C7E" w:val="clear"/>
+            <w:tcMar>
+              <w:top w:type="dxa" w:w="120"/>
+              <w:left w:type="dxa" w:w="140"/>
+              <w:bottom w:type="dxa" w:w="100"/>
+              <w:right w:type="dxa" w:w="140"/>
+            </w:tcMar>
+          </w:tcPr>
+          <w:p>
+            <w:r>
+              <w:rPr>
+                <w:b/>
+                <w:bCs/>
+                <w:color w:val="FFFFFF"/>
+                <w:sz w:val="19"/>
+                <w:szCs w:val="19"/>
+              </w:rPr>
+              <w:t xml:space="preserve">05 · Multi-Market</w:t>
+            </w:r>
+          </w:p>
+        </w:tc>
+      </w:tr>
+      <w:tr>
+        <w:tc>
+          <w:tcPr>
+            <w:tcW w:type="dxa" w:w="1805"/>
+            <w:shd w:fill="FFE3E4" w:val="clear"/>
+            <w:tcMar>
+              <w:top w:type="dxa" w:w="80"/>
+              <w:left w:type="dxa" w:w="140"/>
+              <w:bottom w:type="dxa" w:w="80"/>
+              <w:right w:type="dxa" w:w="140"/>
+            </w:tcMar>
+          </w:tcPr>
+          <w:p>
+            <w:r>
+              <w:rPr>
+                <w:i/>
+                <w:iCs/>
+                <w:color w:val="B23A3E"/>
+                <w:sz w:val="17"/>
+                <w:szCs w:val="17"/>
+              </w:rPr>
+              <w:t xml:space="preserve">Sep–Oct 2026</w:t>
+            </w:r>
+          </w:p>
+        </w:tc>
+        <w:tc>
+          <w:tcPr>
+            <w:tcW w:type="dxa" w:w="1805"/>
+            <w:shd w:fill="FFE3E4" w:val="clear"/>
+            <w:tcMar>
+              <w:top w:type="dxa" w:w="80"/>
+              <w:left w:type="dxa" w:w="140"/>
+              <w:bottom w:type="dxa" w:w="80"/>
+              <w:right w:type="dxa" w:w="140"/>
+            </w:tcMar>
+          </w:tcPr>
+          <w:p>
+            <w:r>
+              <w:rPr>
+                <w:i/>
+                <w:iCs/>
+                <w:color w:val="B23A3E"/>
+                <w:sz w:val="17"/>
+                <w:szCs w:val="17"/>
+              </w:rPr>
+              <w:t xml:space="preserve">Nov 2026–Feb 2027</w:t>
+            </w:r>
+          </w:p>
+        </w:tc>
+        <w:tc>
+          <w:tcPr>
+            <w:tcW w:type="dxa" w:w="1805"/>
+            <w:shd w:fill="E8EAF3" w:val="clear"/>
+            <w:tcMar>
+              <w:top w:type="dxa" w:w="80"/>
+              <w:left w:type="dxa" w:w="140"/>
+              <w:bottom w:type="dxa" w:w="80"/>
+              <w:right w:type="dxa" w:w="140"/>
+            </w:tcMar>
+          </w:tcPr>
+          <w:p>
+            <w:r>
+              <w:rPr>
+                <w:i/>
+                <w:iCs/>
+                <w:color w:val="3D4A8A"/>
+                <w:sz w:val="17"/>
+                <w:szCs w:val="17"/>
+              </w:rPr>
+              <w:t xml:space="preserve">2027 H1</w:t>
+            </w:r>
+          </w:p>
+        </w:tc>
+        <w:tc>
+          <w:tcPr>
+            <w:tcW w:type="dxa" w:w="1805"/>
+            <w:shd w:fill="E8EAF3" w:val="clear"/>
+            <w:tcMar>
+              <w:top w:type="dxa" w:w="80"/>
+              <w:left w:type="dxa" w:w="140"/>
+              <w:bottom w:type="dxa" w:w="80"/>
+              <w:right w:type="dxa" w:w="140"/>
+            </w:tcMar>
+          </w:tcPr>
+          <w:p>
+            <w:r>
+              <w:rPr>
+                <w:i/>
+                <w:iCs/>
+                <w:color w:val="3D4A8A"/>
+                <w:sz w:val="17"/>
+                <w:szCs w:val="17"/>
+              </w:rPr>
+              <w:t xml:space="preserve">2027 H2</w:t>
+            </w:r>
+          </w:p>
+        </w:tc>
+        <w:tc>
+          <w:tcPr>
+            <w:tcW w:type="dxa" w:w="1805"/>
+            <w:shd w:fill="E8EAF3" w:val="clear"/>
+            <w:tcMar>
+              <w:top w:type="dxa" w:w="80"/>
+              <w:left w:type="dxa" w:w="140"/>
+              <w:bottom w:type="dxa" w:w="80"/>
+              <w:right w:type="dxa" w:w="140"/>
+            </w:tcMar>
+          </w:tcPr>
+          <w:p>
+            <w:r>
+              <w:rPr>
+                <w:i/>
+                <w:iCs/>
+                <w:color w:val="3D4A8A"/>
+                <w:sz w:val="17"/>
+                <w:szCs w:val="17"/>
+              </w:rPr>
+              <w:t xml:space="preserve">2028+</w:t>
+            </w:r>
+          </w:p>
+        </w:tc>
+      </w:tr>
+      <w:tr>
+        <w:tc>
+          <w:tcPr>
+            <w:tcW w:type="dxa" w:w="1805"/>
+            <w:shd w:fill="FFF3F3" w:val="clear"/>
+            <w:tcMar>
+              <w:top w:type="dxa" w:w="100"/>
+              <w:left w:type="dxa" w:w="140"/>
+              <w:bottom w:type="dxa" w:w="140"/>
+              <w:right w:type="dxa" w:w="140"/>
+            </w:tcMar>
+          </w:tcPr>
+          <w:p>
+            <w:pPr>
+              <w:spacing w:after="80"/>
+            </w:pPr>
+            <w:r>
+              <w:rPr>
+                <w:color w:val="1B1F3B"/>
+                <w:sz w:val="17"/>
+                <w:szCs w:val="17"/>
+              </w:rPr>
+              <w:t xml:space="preserve">10–20 India founder interviews. Kill criteria set. Zero production code.</w:t>
+            </w:r>
+          </w:p>
+          <w:p>
+            <w:r>
+              <w:rPr>
+                <w:b/>
+                <w:bCs/>
+                <w:color w:val="F96167"/>
+                <w:sz w:val="14"/>
+                <w:szCs w:val="14"/>
+              </w:rPr>
+              <w:t xml:space="preserve">THIS RAISE</w:t>
+            </w:r>
+          </w:p>
+        </w:tc>
+        <w:tc>
+          <w:tcPr>
+            <w:tcW w:type="dxa" w:w="1805"/>
+            <w:shd w:fill="FFF3F3" w:val="clear"/>
+            <w:tcMar>
+              <w:top w:type="dxa" w:w="100"/>
+              <w:left w:type="dxa" w:w="140"/>
+              <w:bottom w:type="dxa" w:w="140"/>
+              <w:right w:type="dxa" w:w="140"/>
+            </w:tcMar>
+          </w:tcPr>
+          <w:p>
+            <w:pPr>
+              <w:spacing w:after="80"/>
+            </w:pPr>
+            <w:r>
+              <w:rPr>
+                <w:color w:val="1B1F3B"/>
+                <w:sz w:val="17"/>
+                <w:szCs w:val="17"/>
+              </w:rPr>
+              <w:t xml:space="preserve">3 core integrations live. 5–10 paying design-partner brands.</w:t>
+            </w:r>
+          </w:p>
+          <w:p>
+            <w:r>
+              <w:rPr>
+                <w:b/>
+                <w:bCs/>
+                <w:color w:val="F96167"/>
+                <w:sz w:val="14"/>
+                <w:szCs w:val="14"/>
+              </w:rPr>
+              <w:t xml:space="preserve">THIS RAISE</w:t>
+            </w:r>
+          </w:p>
+        </w:tc>
+        <w:tc>
+          <w:tcPr>
+            <w:tcW w:type="dxa" w:w="1805"/>
+            <w:shd w:fill="F2F3F9" w:val="clear"/>
+            <w:tcMar>
+              <w:top w:type="dxa" w:w="100"/>
+              <w:left w:type="dxa" w:w="140"/>
+              <w:bottom w:type="dxa" w:w="140"/>
+              <w:right w:type="dxa" w:w="140"/>
+            </w:tcMar>
+          </w:tcPr>
+          <w:p>
+            <w:pPr>
+              <w:spacing w:after="80"/>
+            </w:pPr>
+            <w:r>
+              <w:rPr>
+                <w:color w:val="1B1F3B"/>
+                <w:sz w:val="17"/>
+                <w:szCs w:val="17"/>
+              </w:rPr>
+              <w:t xml:space="preserve">Full feature set incl. AI copilot. 30+ paying brands. Unit economics proven.</w:t>
+            </w:r>
+          </w:p>
+          <w:p/>
+        </w:tc>
+        <w:tc>
+          <w:tcPr>
+            <w:tcW w:type="dxa" w:w="1805"/>
+            <w:shd w:fill="F2F3F9" w:val="clear"/>
+            <w:tcMar>
+              <w:top w:type="dxa" w:w="100"/>
+              <w:left w:type="dxa" w:w="140"/>
+              <w:bottom w:type="dxa" w:w="140"/>
+              <w:right w:type="dxa" w:w="140"/>
+            </w:tcMar>
+          </w:tcPr>
+          <w:p>
+            <w:pPr>
+              <w:spacing w:after="80"/>
+            </w:pPr>
+            <w:r>
+              <w:rPr>
+                <w:color w:val="1B1F3B"/>
+                <w:sz w:val="17"/>
+                <w:szCs w:val="17"/>
+              </w:rPr>
+              <w:t xml:space="preserve">Test the same payment-ecosystem-gap thesis in one new market (SEA or LatAm).</w:t>
+            </w:r>
+          </w:p>
+          <w:p/>
+        </w:tc>
+        <w:tc>
+          <w:tcPr>
+            <w:tcW w:type="dxa" w:w="1805"/>
+            <w:shd w:fill="F2F3F9" w:val="clear"/>
+            <w:tcMar>
+              <w:top w:type="dxa" w:w="100"/>
+              <w:left w:type="dxa" w:w="140"/>
+              <w:bottom w:type="dxa" w:w="140"/>
+              <w:right w:type="dxa" w:w="140"/>
+            </w:tcMar>
+          </w:tcPr>
+          <w:p>
+            <w:pPr>
+              <w:spacing w:after="80"/>
+            </w:pPr>
+            <w:r>
+              <w:rPr>
+                <w:color w:val="1B1F3B"/>
+                <w:sz w:val="17"/>
+                <w:szCs w:val="17"/>
+              </w:rPr>
+              <w:t xml:space="preserve">Repeat the proven playbook market-by-market. Global positioning, now earned.</w:t>
+            </w:r>
+          </w:p>
+          <w:p/>
+        </w:tc>
+      </w:tr>
+    </w:tbl>
+    <w:p>
+      <w:pPr>
+        <w:spacing w:after="200"/>
+      </w:pPr>
+    </w:p>
+    <w:p>
+      <w:pPr>
+        <w:pStyle w:val="Heading1"/>
+        <w:pBdr>
+          <w:top w:val="single" w:color="F96167" w:sz="14" w:space="8"/>
+        </w:pBdr>
+        <w:spacing w:after="40" w:before="420"/>
+      </w:pPr>
+      <w:r>
+        <w:rPr>
+          <w:rFonts w:ascii="Cambria" w:cs="Cambria" w:eastAsia="Cambria" w:hAnsi="Cambria"/>
+          <w:b/>
+          <w:bCs/>
+          <w:color w:val="2F3C7E"/>
+          <w:sz w:val="32"/>
+          <w:szCs w:val="32"/>
+        </w:rPr>
+        <w:t xml:space="preserve">9. Bottom Line</w:t>
+      </w:r>
+    </w:p>
+    <w:p>
+      <w:pPr>
+        <w:spacing w:after="200" w:line="300"/>
+      </w:pPr>
+      <w:r>
+        <w:rPr>
+          <w:b/>
+          <w:bCs/>
+          <w:color w:val="FFFFFF"/>
+          <w:sz w:val="17"/>
+          <w:szCs w:val="17"/>
+          <w:shd w:fill="F96167" w:val="clear"/>
+        </w:rPr>
+        <w:t xml:space="preserve"> INFERENCE </w:t>
       </w:r>
       <w:r>
         <w:rPr>
           <w:sz w:val="22"/>
           <w:szCs w:val="22"/>
         </w:rPr>
-        <w:t xml:space="preserve">Global is a stronger story for a pitch deck and a weaker starting point for an actual solo-founder build. The honest recommendation: keep the India-first go-to-market and validation plan exactly as it is (the 10–20 founder interviews are still the very next step, unchanged by any of this), but design the product architecture from day one so it isn't hard-coded to India-only — generic currency/locale handling, a plug-in-style integration layer for payment/logistics providers — so that once the India wedge is proven, the same playbook can be repeated in one adjacent emerging market at a time, rather than needing to be rebuilt from scratch.</w:t>
+        <w:t xml:space="preserve">  Global is a stronger story for a pitch deck and a weaker starting point for an actual solo-founder build. The recommendation: keep the India-first validation plan exactly as it is — the 10–20 founder interviews are still the very next step — but design the product architecture from day one so it isn't hard-coded to India-only (generic currency/locale handling, a plug-in-style integration layer for payment/logistics providers), so the same playbook can be repeated in one adjacent emerging market at a time once the India wedge is proven.</w:t>
       </w:r>
     </w:p>
     <w:p>
@@ -2123,15 +2704,29 @@
         <w:spacing w:after="200" w:line="300"/>
       </w:pPr>
       <w:r>
+        <w:rPr>
+          <w:color w:val="1B1F3B"/>
+        </w:rPr>
         <w:t xml:space="preserve">That gets you the global ambition without giving up the one piece of evidence that currently makes this idea defensible.</w:t>
       </w:r>
     </w:p>
     <w:p>
       <w:pPr>
         <w:pStyle w:val="Heading1"/>
-        <w:spacing w:after="200" w:before="400"/>
-      </w:pPr>
-      <w:r>
+        <w:pBdr>
+          <w:top w:val="single" w:color="F96167" w:sz="14" w:space="8"/>
+        </w:pBdr>
+        <w:spacing w:after="40" w:before="420"/>
+      </w:pPr>
+      <w:r>
+        <w:rPr>
+          <w:rFonts w:ascii="Cambria" w:cs="Cambria" w:eastAsia="Cambria" w:hAnsi="Cambria"/>
+          <w:b/>
+          <w:bCs/>
+          <w:color w:val="2F3C7E"/>
+          <w:sz w:val="32"/>
+          <w:szCs w:val="32"/>
+        </w:rPr>
         <w:t xml:space="preserve">Sources</w:t>
       </w:r>
     </w:p>
@@ -2143,8 +2738,9 @@
         <w:rPr>
           <w:i/>
           <w:iCs/>
-        </w:rPr>
-        <w:t xml:space="preserve">Grand View Research — B2C E-commerce Market Size And Share Report, 2026–2033. Mordor Intelligence — India D2C E-commerce Market Analysis (2026). Triple Whale Help Center — currency support article. DealStreetAsia, TechCrunch, Tracxn — Plugo Series A coverage. G2 review pages and vendor pricing pages for Triple Whale, Polar Analytics, Northbeam, Rockerbox, Daasity, Glew.io, Lifesight, Putler (carried forward from the original India-focused research pass). All confidence tags reflect the discipline established in the Ecommerce Hub vault research: verified facts are independently confirmed via primary sources; vendor claims are marketing-only; inference is Claude's own synthesis, always flagged as such.</w:t>
+          <w:color w:val="1B1F3B"/>
+        </w:rPr>
+        <w:t xml:space="preserve">Grand View Research — B2C E-commerce Market Size And Share Report, 2026–2033. Mordor Intelligence — India D2C E-commerce Market Analysis (2026). Triple Whale Help Center — currency support article. DealStreetAsia, TechCrunch, Tracxn — Plugo Series A coverage. G2 review pages and vendor pricing pages for Triple Whale, Polar Analytics, Northbeam, Rockerbox, Daasity, Glew.io, Lifesight, Putler. All confidence tags reflect the discipline established across the Ecommerce Hub vault research: verified facts are independently confirmed via primary sources; vendor claims are marketing-only; inference is Claude's own synthesis, always flagged as such.</w:t>
       </w:r>
     </w:p>
     <w:sectPr>
@@ -2514,39 +3110,5 @@
       <w:szCs w:val="20"/>
     </w:rPr>
   </w:style>
-  <w:style w:type="paragraph" w:styleId="Heading1">
-    <w:name w:val="Heading 1"/>
-    <w:basedOn w:val="Normal"/>
-    <w:next w:val="Normal"/>
-    <w:qFormat/>
-    <w:pPr>
-      <w:spacing w:after="200" w:before="400"/>
-    </w:pPr>
-    <w:rPr>
-      <w:rFonts w:ascii="Cambria" w:cs="Cambria" w:eastAsia="Cambria" w:hAnsi="Cambria"/>
-      <w:b/>
-      <w:bCs/>
-      <w:color w:val="2F3C7E"/>
-      <w:sz w:val="32"/>
-      <w:szCs w:val="32"/>
-    </w:rPr>
-  </w:style>
-  <w:style w:type="paragraph" w:styleId="Heading2">
-    <w:name w:val="Heading 2"/>
-    <w:basedOn w:val="Normal"/>
-    <w:next w:val="Normal"/>
-    <w:qFormat/>
-    <w:pPr>
-      <w:spacing w:after="150" w:before="300"/>
-    </w:pPr>
-    <w:rPr>
-      <w:rFonts w:ascii="Cambria" w:cs="Cambria" w:eastAsia="Cambria" w:hAnsi="Cambria"/>
-      <w:b/>
-      <w:bCs/>
-      <w:color w:val="F96167"/>
-      <w:sz w:val="26"/>
-      <w:szCs w:val="26"/>
-    </w:rPr>
-  </w:style>
 </w:styles>
 </file>
</xml_diff>

<commit_message>
Deck+report: real traction, competitor detail, AI-model feature, deAI-ify copy
</commit_message>
<xml_diff>
--- a/A priyam ka patora/Startup Ideas/03 - Ecommerce Hub/Ecommerce_Hub_Global_Report.docx
+++ b/A priyam ka patora/Startup Ideas/03 - Ecommerce Hub/Ecommerce_Hub_Global_Report.docx
@@ -149,7 +149,7 @@
                 <w:sz w:val="16"/>
                 <w:szCs w:val="16"/>
               </w:rPr>
-              <w:t xml:space="preserve">  Claude's own synthesis, not sourced fact</w:t>
+              <w:t xml:space="preserve">  original synthesis, not a sourced fact</w:t>
             </w:r>
           </w:p>
         </w:tc>
@@ -387,6 +387,17 @@
           <w:szCs w:val="32"/>
         </w:rPr>
         <w:t xml:space="preserve">3. Market Opportunity — India Now, Global Later</w:t>
+      </w:r>
+    </w:p>
+    <w:p>
+      <w:pPr>
+        <w:spacing w:after="200" w:line="300"/>
+      </w:pPr>
+      <w:r>
+        <w:rPr>
+          <w:color w:val="1B1F3B"/>
+        </w:rPr>
+        <w:t xml:space="preserve">Both numbers below describe a category that is still taking shape, not one already won by a single incumbent. None of the eight competitors in Section 4 is more than a handful of years old, and no player has consolidated either the India or the global segment yet — the argument for entering now is that the market is already large and still forming, not large and already settled.</w:t>
       </w:r>
     </w:p>
     <w:p>
@@ -775,7 +786,7 @@
                 <w:sz w:val="20"/>
                 <w:szCs w:val="20"/>
               </w:rPr>
-              <w:t xml:space="preserve">What it does</w:t>
+              <w:t xml:space="preserve">Flagship offering</w:t>
             </w:r>
           </w:p>
         </w:tc>
@@ -1491,7 +1502,7 @@
           <w:sz w:val="32"/>
           <w:szCs w:val="32"/>
         </w:rPr>
-        <w:t xml:space="preserve">5. Recommended Feature Set — Claude's Own Suggestions</w:t>
+        <w:t xml:space="preserve">5. Recommended Feature Set &amp; Product Vision</w:t>
       </w:r>
     </w:p>
     <w:p>
@@ -1514,7 +1525,7 @@
           <w:sz w:val="22"/>
           <w:szCs w:val="22"/>
         </w:rPr>
-        <w:t xml:space="preserve">  Everything below is my own product judgment on what makes analytics/BI tools genuinely sticky — none of it is user-validated. Treat this as a prioritization menu for real founder conversations, not a committed roadmap.</w:t>
+        <w:t xml:space="preserve">  Everything below is product judgment on what makes analytics/BI tools genuinely sticky — a prioritization menu for real founder conversations, not a committed roadmap or something already user-validated.</w:t>
       </w:r>
     </w:p>
     <w:p>
@@ -1544,7 +1555,20 @@
         <w:spacing w:after="120" w:line="280"/>
       </w:pPr>
       <w:r>
-        <w:t xml:space="preserve">Natural-language copilot — ask a question ("why did CAC spike Tuesday"), get an answer, not another chart. Most likely single feature to make the product feel alive to non-technical founders.</w:t>
+        <w:t xml:space="preserve">Private, brand-trained AI model — the flagship long-term differentiator. Instead of a generic model answering from public data, this is trained continuously on each brand's own sales, inventory, and customer history. It moves the product from "here's what happened" to "here's what to do next": which SKUs to discount before they go stale, which channel is under- or over-funded, which customer cohort is about to churn and what offer might save them. The model gets sharper the longer a brand stays on the platform — a data flywheel that's genuinely hard for a dashboard-only competitor to copy. This is a build target for the India Scale phase (Section 8), not a feature live today.</w:t>
+      </w:r>
+    </w:p>
+    <w:p>
+      <w:pPr>
+        <w:pStyle w:val="ListParagraph"/>
+        <w:numPr>
+          <w:ilvl w:val="0"/>
+          <w:numId w:val="1"/>
+        </w:numPr>
+        <w:spacing w:after="120" w:line="280"/>
+      </w:pPr>
+      <w:r>
+        <w:t xml:space="preserve">Natural-language copilot — ask a question ("why did CAC spike Tuesday"), get an answer, not another chart. The fastest, most demoable step toward the brand-trained AI above, and the single most likely feature to make the product feel alive to non-technical founders.</w:t>
       </w:r>
     </w:p>
     <w:p>
@@ -2230,7 +2254,7 @@
         <w:rPr>
           <w:color w:val="1B1F3B"/>
         </w:rPr>
-        <w:t xml:space="preserve">This is the answer to "what do I actually do": prove the India wedge completely before spending a single dollar on global positioning. The table below is the same roadmap used in the pitch deck — phases 01–02 are what a pre-seed raise funds; 03–05 are the vision that path validates, not something being asked for today.</w:t>
+        <w:t xml:space="preserve">This is the answer to "what do I actually do": prove the India wedge completely before spending a single dollar on global positioning. Outreach to Indian D2C brand founders is already underway — early conversations are being used right now to pressure-test the feature list in Section 5 and finalize which integrations matter most, before any production code is written. The table below is the same roadmap used in the pitch deck — phases 01–02 are what a pre-seed raise completes; 03–05 are the vision that path validates, not something being asked for today.</w:t>
       </w:r>
     </w:p>
     <w:tbl>
@@ -2518,7 +2542,7 @@
                 <w:sz w:val="17"/>
                 <w:szCs w:val="17"/>
               </w:rPr>
-              <w:t xml:space="preserve">10–20 India founder interviews. Kill criteria set. Zero production code.</w:t>
+              <w:t xml:space="preserve">Founder conversations already underway. 10–20 India D2C brands total. Kill criteria set, zero production code yet.</w:t>
             </w:r>
           </w:p>
           <w:p>
@@ -2696,7 +2720,7 @@
           <w:sz w:val="22"/>
           <w:szCs w:val="22"/>
         </w:rPr>
-        <w:t xml:space="preserve">  Global is a stronger story for a pitch deck and a weaker starting point for an actual solo-founder build. The recommendation: keep the India-first validation plan exactly as it is — the 10–20 founder interviews are still the very next step — but design the product architecture from day one so it isn't hard-coded to India-only (generic currency/locale handling, a plug-in-style integration layer for payment/logistics providers), so the same playbook can be repeated in one adjacent emerging market at a time once the India wedge is proven.</w:t>
+        <w:t xml:space="preserve">  Global is a stronger story for a pitch deck and a weaker starting point for an actual solo-founder build. The recommendation: keep the India-first validation plan exactly as it is — the founder conversations already underway are the thing to finish, not restart — but design the product architecture from day one so it isn't hard-coded to India-only (generic currency/locale handling, a plug-in-style integration layer for payment/logistics providers), so the same playbook can be repeated in one adjacent emerging market at a time once the India wedge is proven.</w:t>
       </w:r>
     </w:p>
     <w:p>
@@ -2740,7 +2764,7 @@
           <w:iCs/>
           <w:color w:val="1B1F3B"/>
         </w:rPr>
-        <w:t xml:space="preserve">Grand View Research — B2C E-commerce Market Size And Share Report, 2026–2033. Mordor Intelligence — India D2C E-commerce Market Analysis (2026). Triple Whale Help Center — currency support article. DealStreetAsia, TechCrunch, Tracxn — Plugo Series A coverage. G2 review pages and vendor pricing pages for Triple Whale, Polar Analytics, Northbeam, Rockerbox, Daasity, Glew.io, Lifesight, Putler. All confidence tags reflect the discipline established across the Ecommerce Hub vault research: verified facts are independently confirmed via primary sources; vendor claims are marketing-only; inference is Claude's own synthesis, always flagged as such.</w:t>
+        <w:t xml:space="preserve">Grand View Research — B2C E-commerce Market Size And Share Report, 2026–2033. Mordor Intelligence — India D2C E-commerce Market Analysis (2026). Triple Whale Help Center — currency support article. DealStreetAsia, TechCrunch, Tracxn — Plugo Series A coverage. G2 review pages and vendor pricing pages for Triple Whale, Polar Analytics, Northbeam, Rockerbox, Daasity, Glew.io, Lifesight, Putler. All confidence tags reflect the discipline established across the Ecommerce Hub vault research: verified facts are independently confirmed via primary sources; vendor claims are marketing-only; inference is original synthesis, always flagged as such.</w:t>
       </w:r>
     </w:p>
     <w:sectPr>

</xml_diff>

<commit_message>
Broaden connector list beyond Razorpay/Shiprocket across deck and report
</commit_message>
<xml_diff>
--- a/A priyam ka patora/Startup Ideas/03 - Ecommerce Hub/Ecommerce_Hub_Global_Report.docx
+++ b/A priyam ka patora/Startup Ideas/03 - Ecommerce Hub/Ecommerce_Hub_Global_Report.docx
@@ -216,7 +216,7 @@
           <w:sz w:val="22"/>
           <w:szCs w:val="22"/>
         </w:rPr>
-        <w:t xml:space="preserve">  Going global trades away the one verified, defensible advantage this idea currently has. The India-native gap (no major global tool supports Razorpay or Indian logistics) is a specific, source-confirmed hole in the market. "Global" has no equivalent confirmed hole — the same big, funded players already claim to serve the whole world.</w:t>
+        <w:t xml:space="preserve">  Going global trades away the one verified, defensible advantage this idea currently has. The India-native gap (no major global tool supports Razorpay, Cashfree, PayU, or Indian logistics carriers) is a specific, source-confirmed hole in the market. "Global" has no equivalent confirmed hole — the same big, funded players already claim to serve the whole world.</w:t>
       </w:r>
     </w:p>
     <w:p>
@@ -227,7 +227,7 @@
         <w:rPr>
           <w:color w:val="1B1F3B"/>
         </w:rPr>
-        <w:t xml:space="preserve">That doesn't mean don't do it — it means sequencing matters. Section 2 lays out why. Section 8 turns that into the actual phased roadmap: India immersion first, global earned later, not assumed up front.</w:t>
+        <w:t xml:space="preserve">That doesn't mean don't do it — it means sequencing matters. Section 2 lays out why. Section 9 turns that into the actual phased roadmap: India immersion first, global earned later, not assumed up front.</w:t>
       </w:r>
     </w:p>
     <w:p>
@@ -1502,9 +1502,436 @@
           <w:sz w:val="32"/>
           <w:szCs w:val="32"/>
         </w:rPr>
-        <w:t xml:space="preserve">5. Recommended Feature Set &amp; Product Vision</w:t>
-      </w:r>
-    </w:p>
+        <w:t xml:space="preserve">5. The Connector Landscape — Not Just Razorpay</w:t>
+      </w:r>
+    </w:p>
+    <w:p>
+      <w:pPr>
+        <w:spacing w:after="200" w:line="300"/>
+      </w:pPr>
+      <w:r>
+        <w:rPr>
+          <w:color w:val="1B1F3B"/>
+        </w:rPr>
+        <w:t xml:space="preserve">An earlier pass listed only Razorpay and Shiprocket/Delhivery as the India-native integrations, which understates the actual number of tools a serious integration layer needs to cover. The table below broadens that out by category, with the 3-5 names in each that actually matter for Indian D2C brands as of 2025-2026.</w:t>
+      </w:r>
+    </w:p>
+    <w:tbl>
+      <w:tblPr>
+        <w:tblW w:type="dxa" w:w="9026"/>
+        <w:tblBorders>
+          <w:top w:val="single" w:color="auto" w:sz="4"/>
+          <w:left w:val="single" w:color="auto" w:sz="4"/>
+          <w:bottom w:val="single" w:color="auto" w:sz="4"/>
+          <w:right w:val="single" w:color="auto" w:sz="4"/>
+          <w:insideH w:val="single" w:color="auto" w:sz="4"/>
+          <w:insideV w:val="single" w:color="auto" w:sz="4"/>
+        </w:tblBorders>
+      </w:tblPr>
+      <w:tblGrid>
+        <w:gridCol w:w="1800"/>
+        <w:gridCol w:w="3400"/>
+        <w:gridCol w:w="3826"/>
+      </w:tblGrid>
+      <w:tr>
+        <w:trPr>
+          <w:tblHeader/>
+        </w:trPr>
+        <w:tc>
+          <w:tcPr>
+            <w:tcW w:type="dxa" w:w="1800"/>
+            <w:shd w:fill="2F3C7E" w:val="clear"/>
+            <w:vAlign w:val="center"/>
+          </w:tcPr>
+          <w:p>
+            <w:r>
+              <w:rPr>
+                <w:b/>
+                <w:bCs/>
+                <w:color w:val="FFFFFF"/>
+                <w:sz w:val="20"/>
+                <w:szCs w:val="20"/>
+              </w:rPr>
+              <w:t xml:space="preserve">Category</w:t>
+            </w:r>
+          </w:p>
+        </w:tc>
+        <w:tc>
+          <w:tcPr>
+            <w:tcW w:type="dxa" w:w="3400"/>
+            <w:shd w:fill="2F3C7E" w:val="clear"/>
+            <w:vAlign w:val="center"/>
+          </w:tcPr>
+          <w:p>
+            <w:r>
+              <w:rPr>
+                <w:b/>
+                <w:bCs/>
+                <w:color w:val="FFFFFF"/>
+                <w:sz w:val="20"/>
+                <w:szCs w:val="20"/>
+              </w:rPr>
+              <w:t xml:space="preserve">Who's actually in use</w:t>
+            </w:r>
+          </w:p>
+        </w:tc>
+        <w:tc>
+          <w:tcPr>
+            <w:tcW w:type="dxa" w:w="3826"/>
+            <w:shd w:fill="2F3C7E" w:val="clear"/>
+            <w:vAlign w:val="center"/>
+          </w:tcPr>
+          <w:p>
+            <w:r>
+              <w:rPr>
+                <w:b/>
+                <w:bCs/>
+                <w:color w:val="FFFFFF"/>
+                <w:sz w:val="20"/>
+                <w:szCs w:val="20"/>
+              </w:rPr>
+              <w:t xml:space="preserve">Why it matters</w:t>
+            </w:r>
+          </w:p>
+        </w:tc>
+      </w:tr>
+      <w:tr>
+        <w:tc>
+          <w:tcPr>
+            <w:tcW w:type="dxa" w:w="1800"/>
+            <w:shd w:fill="FFFFFF" w:val="clear"/>
+          </w:tcPr>
+          <w:p>
+            <w:pPr>
+              <w:spacing w:after="60"/>
+            </w:pPr>
+            <w:r>
+              <w:rPr>
+                <w:sz w:val="20"/>
+                <w:szCs w:val="20"/>
+              </w:rPr>
+              <w:t xml:space="preserve">Payments</w:t>
+            </w:r>
+          </w:p>
+        </w:tc>
+        <w:tc>
+          <w:tcPr>
+            <w:tcW w:type="dxa" w:w="3400"/>
+            <w:shd w:fill="FFFFFF" w:val="clear"/>
+          </w:tcPr>
+          <w:p>
+            <w:pPr>
+              <w:spacing w:after="60"/>
+            </w:pPr>
+            <w:r>
+              <w:rPr>
+                <w:sz w:val="20"/>
+                <w:szCs w:val="20"/>
+              </w:rPr>
+              <w:t xml:space="preserve">Razorpay, Cashfree, PayU, PhonePe PG</w:t>
+            </w:r>
+          </w:p>
+        </w:tc>
+        <w:tc>
+          <w:tcPr>
+            <w:tcW w:type="dxa" w:w="3826"/>
+            <w:shd w:fill="FFFFFF" w:val="clear"/>
+          </w:tcPr>
+          <w:p>
+            <w:pPr>
+              <w:spacing w:after="60"/>
+            </w:pPr>
+            <w:r>
+              <w:rPr>
+                <w:sz w:val="20"/>
+                <w:szCs w:val="20"/>
+              </w:rPr>
+              <w:t xml:space="preserve">Razorpay leads India-first startups; Cashfree is its closest rival; PayU still runs large/legacy brands; PhonePe PG is newer but growing fast off UPI dominance.</w:t>
+            </w:r>
+          </w:p>
+        </w:tc>
+      </w:tr>
+      <w:tr>
+        <w:tc>
+          <w:tcPr>
+            <w:tcW w:type="dxa" w:w="1800"/>
+            <w:shd w:fill="F7F7F6" w:val="clear"/>
+          </w:tcPr>
+          <w:p>
+            <w:pPr>
+              <w:spacing w:after="60"/>
+            </w:pPr>
+            <w:r>
+              <w:rPr>
+                <w:sz w:val="20"/>
+                <w:szCs w:val="20"/>
+              </w:rPr>
+              <w:t xml:space="preserve">Logistics &amp; shipping</w:t>
+            </w:r>
+          </w:p>
+        </w:tc>
+        <w:tc>
+          <w:tcPr>
+            <w:tcW w:type="dxa" w:w="3400"/>
+            <w:shd w:fill="F7F7F6" w:val="clear"/>
+          </w:tcPr>
+          <w:p>
+            <w:pPr>
+              <w:spacing w:after="60"/>
+            </w:pPr>
+            <w:r>
+              <w:rPr>
+                <w:sz w:val="20"/>
+                <w:szCs w:val="20"/>
+              </w:rPr>
+              <w:t xml:space="preserve">Shiprocket, Delhivery, XpressBees, Ecom Express, Shadowfax</w:t>
+            </w:r>
+          </w:p>
+        </w:tc>
+        <w:tc>
+          <w:tcPr>
+            <w:tcW w:type="dxa" w:w="3826"/>
+            <w:shd w:fill="F7F7F6" w:val="clear"/>
+          </w:tcPr>
+          <w:p>
+            <w:pPr>
+              <w:spacing w:after="60"/>
+            </w:pPr>
+            <w:r>
+              <w:rPr>
+                <w:sz w:val="20"/>
+                <w:szCs w:val="20"/>
+              </w:rPr>
+              <w:t xml:space="preserve">Shiprocket is the dominant aggregator for Shopify-era D2C; Delhivery is the largest independent 3PL; XpressBees and Ecom Express carry major D2C volume; Shadowfax is fast-growing in last-mile.</w:t>
+            </w:r>
+          </w:p>
+        </w:tc>
+      </w:tr>
+      <w:tr>
+        <w:tc>
+          <w:tcPr>
+            <w:tcW w:type="dxa" w:w="1800"/>
+            <w:shd w:fill="FFFFFF" w:val="clear"/>
+          </w:tcPr>
+          <w:p>
+            <w:pPr>
+              <w:spacing w:after="60"/>
+            </w:pPr>
+            <w:r>
+              <w:rPr>
+                <w:sz w:val="20"/>
+                <w:szCs w:val="20"/>
+              </w:rPr>
+              <w:t xml:space="preserve">WhatsApp / BSPs</w:t>
+            </w:r>
+          </w:p>
+        </w:tc>
+        <w:tc>
+          <w:tcPr>
+            <w:tcW w:type="dxa" w:w="3400"/>
+            <w:shd w:fill="FFFFFF" w:val="clear"/>
+          </w:tcPr>
+          <w:p>
+            <w:pPr>
+              <w:spacing w:after="60"/>
+            </w:pPr>
+            <w:r>
+              <w:rPr>
+                <w:sz w:val="20"/>
+                <w:szCs w:val="20"/>
+              </w:rPr>
+              <w:t xml:space="preserve">AiSensy, Wati, Interakt, Gupshup</w:t>
+            </w:r>
+          </w:p>
+        </w:tc>
+        <w:tc>
+          <w:tcPr>
+            <w:tcW w:type="dxa" w:w="3826"/>
+            <w:shd w:fill="FFFFFF" w:val="clear"/>
+          </w:tcPr>
+          <w:p>
+            <w:pPr>
+              <w:spacing w:after="60"/>
+            </w:pPr>
+            <w:r>
+              <w:rPr>
+                <w:sz w:val="20"/>
+                <w:szCs w:val="20"/>
+              </w:rPr>
+              <w:t xml:space="preserve">AiSensy, Wati, and Interakt are the India-first BSPs built specifically for SME/D2C use cases (COD confirmation, cart recovery); Gupshup is the larger enterprise-grade layer many brands sit on without realizing it.</w:t>
+            </w:r>
+          </w:p>
+        </w:tc>
+      </w:tr>
+      <w:tr>
+        <w:tc>
+          <w:tcPr>
+            <w:tcW w:type="dxa" w:w="1800"/>
+            <w:shd w:fill="F7F7F6" w:val="clear"/>
+          </w:tcPr>
+          <w:p>
+            <w:pPr>
+              <w:spacing w:after="60"/>
+            </w:pPr>
+            <w:r>
+              <w:rPr>
+                <w:sz w:val="20"/>
+                <w:szCs w:val="20"/>
+              </w:rPr>
+              <w:t xml:space="preserve">Storefront &amp; OMS</w:t>
+            </w:r>
+          </w:p>
+        </w:tc>
+        <w:tc>
+          <w:tcPr>
+            <w:tcW w:type="dxa" w:w="3400"/>
+            <w:shd w:fill="F7F7F6" w:val="clear"/>
+          </w:tcPr>
+          <w:p>
+            <w:pPr>
+              <w:spacing w:after="60"/>
+            </w:pPr>
+            <w:r>
+              <w:rPr>
+                <w:sz w:val="20"/>
+                <w:szCs w:val="20"/>
+              </w:rPr>
+              <w:t xml:space="preserve">Shopify, WooCommerce, Unicommerce</w:t>
+            </w:r>
+          </w:p>
+        </w:tc>
+        <w:tc>
+          <w:tcPr>
+            <w:tcW w:type="dxa" w:w="3826"/>
+            <w:shd w:fill="F7F7F6" w:val="clear"/>
+          </w:tcPr>
+          <w:p>
+            <w:pPr>
+              <w:spacing w:after="60"/>
+            </w:pPr>
+            <w:r>
+              <w:rPr>
+                <w:sz w:val="20"/>
+                <w:szCs w:val="20"/>
+              </w:rPr>
+              <w:t xml:space="preserve">Shopify is the clear default for funded/scaling Indian D2C; Unicommerce is the standard multi-channel order/inventory layer sitting behind marketplace + own-site operations for most serious sellers.</w:t>
+            </w:r>
+          </w:p>
+        </w:tc>
+      </w:tr>
+      <w:tr>
+        <w:tc>
+          <w:tcPr>
+            <w:tcW w:type="dxa" w:w="1800"/>
+            <w:shd w:fill="FFFFFF" w:val="clear"/>
+          </w:tcPr>
+          <w:p>
+            <w:pPr>
+              <w:spacing w:after="60"/>
+            </w:pPr>
+            <w:r>
+              <w:rPr>
+                <w:sz w:val="20"/>
+                <w:szCs w:val="20"/>
+              </w:rPr>
+              <w:t xml:space="preserve">Marketplaces</w:t>
+            </w:r>
+          </w:p>
+        </w:tc>
+        <w:tc>
+          <w:tcPr>
+            <w:tcW w:type="dxa" w:w="3400"/>
+            <w:shd w:fill="FFFFFF" w:val="clear"/>
+          </w:tcPr>
+          <w:p>
+            <w:pPr>
+              <w:spacing w:after="60"/>
+            </w:pPr>
+            <w:r>
+              <w:rPr>
+                <w:sz w:val="20"/>
+                <w:szCs w:val="20"/>
+              </w:rPr>
+              <w:t xml:space="preserve">Amazon, Flipkart, Myntra, Nykaa, Meesho</w:t>
+            </w:r>
+          </w:p>
+        </w:tc>
+        <w:tc>
+          <w:tcPr>
+            <w:tcW w:type="dxa" w:w="3826"/>
+            <w:shd w:fill="FFFFFF" w:val="clear"/>
+          </w:tcPr>
+          <w:p>
+            <w:pPr>
+              <w:spacing w:after="60"/>
+            </w:pPr>
+            <w:r>
+              <w:rPr>
+                <w:sz w:val="20"/>
+                <w:szCs w:val="20"/>
+              </w:rPr>
+              <w:t xml:space="preserve">Amazon and Flipkart are near-universal; Myntra is close to mandatory for fashion/apparel; Nykaa for beauty/personal-care; Meesho is increasingly relevant for value/mass-market expansion.</w:t>
+            </w:r>
+          </w:p>
+        </w:tc>
+      </w:tr>
+      <w:tr>
+        <w:tc>
+          <w:tcPr>
+            <w:tcW w:type="dxa" w:w="1800"/>
+            <w:shd w:fill="F7F7F6" w:val="clear"/>
+          </w:tcPr>
+          <w:p>
+            <w:pPr>
+              <w:spacing w:after="60"/>
+            </w:pPr>
+            <w:r>
+              <w:rPr>
+                <w:sz w:val="20"/>
+                <w:szCs w:val="20"/>
+              </w:rPr>
+              <w:t xml:space="preserve">Ads &amp; analytics</w:t>
+            </w:r>
+          </w:p>
+        </w:tc>
+        <w:tc>
+          <w:tcPr>
+            <w:tcW w:type="dxa" w:w="3400"/>
+            <w:shd w:fill="F7F7F6" w:val="clear"/>
+          </w:tcPr>
+          <w:p>
+            <w:pPr>
+              <w:spacing w:after="60"/>
+            </w:pPr>
+            <w:r>
+              <w:rPr>
+                <w:sz w:val="20"/>
+                <w:szCs w:val="20"/>
+              </w:rPr>
+              <w:t xml:space="preserve">Meta Ads, Google Ads, GA4</w:t>
+            </w:r>
+          </w:p>
+        </w:tc>
+        <w:tc>
+          <w:tcPr>
+            <w:tcW w:type="dxa" w:w="3826"/>
+            <w:shd w:fill="F7F7F6" w:val="clear"/>
+          </w:tcPr>
+          <w:p>
+            <w:pPr>
+              <w:spacing w:after="60"/>
+            </w:pPr>
+            <w:r>
+              <w:rPr>
+                <w:sz w:val="20"/>
+                <w:szCs w:val="20"/>
+              </w:rPr>
+              <w:t xml:space="preserve">Already covered elsewhere in this deck/report — listed here for completeness of the full connector map.</w:t>
+            </w:r>
+          </w:p>
+        </w:tc>
+      </w:tr>
+    </w:tbl>
     <w:p>
       <w:pPr>
         <w:spacing w:after="200" w:line="300"/>
@@ -1525,6 +1952,49 @@
           <w:sz w:val="22"/>
           <w:szCs w:val="22"/>
         </w:rPr>
+        <w:t xml:space="preserve">  Player identity in each row is corroborated across multiple independent 2025-2026 sources; exact market-share splits are not reliably published and are not claimed here. MVP scope (this raise) is GA4 + one payment gateway + one logistics carrier — this table is the category map the product expands into as it scales, not day-one build scope.</w:t>
+      </w:r>
+    </w:p>
+    <w:p>
+      <w:pPr>
+        <w:pStyle w:val="Heading1"/>
+        <w:pBdr>
+          <w:top w:val="single" w:color="F96167" w:sz="14" w:space="8"/>
+        </w:pBdr>
+        <w:spacing w:after="40" w:before="420"/>
+      </w:pPr>
+      <w:r>
+        <w:rPr>
+          <w:rFonts w:ascii="Cambria" w:cs="Cambria" w:eastAsia="Cambria" w:hAnsi="Cambria"/>
+          <w:b/>
+          <w:bCs/>
+          <w:color w:val="2F3C7E"/>
+          <w:sz w:val="32"/>
+          <w:szCs w:val="32"/>
+        </w:rPr>
+        <w:t xml:space="preserve">6. Recommended Feature Set &amp; Product Vision</w:t>
+      </w:r>
+    </w:p>
+    <w:p>
+      <w:pPr>
+        <w:spacing w:after="200" w:line="300"/>
+      </w:pPr>
+      <w:r>
+        <w:rPr>
+          <w:b/>
+          <w:bCs/>
+          <w:color w:val="FFFFFF"/>
+          <w:sz w:val="17"/>
+          <w:szCs w:val="17"/>
+          <w:shd w:fill="F96167" w:val="clear"/>
+        </w:rPr>
+        <w:t xml:space="preserve"> INFERENCE </w:t>
+      </w:r>
+      <w:r>
+        <w:rPr>
+          <w:sz w:val="22"/>
+          <w:szCs w:val="22"/>
+        </w:rPr>
         <w:t xml:space="preserve">  Everything below is product judgment on what makes analytics/BI tools genuinely sticky — a prioritization menu for real founder conversations, not a committed roadmap or something already user-validated.</w:t>
       </w:r>
     </w:p>
@@ -1542,7 +2012,7 @@
           <w:sz w:val="26"/>
           <w:szCs w:val="26"/>
         </w:rPr>
-        <w:t xml:space="preserve">5.1 Intelligence layer</w:t>
+        <w:t xml:space="preserve">6.1 Intelligence layer</w:t>
       </w:r>
     </w:p>
     <w:p>
@@ -1555,7 +2025,7 @@
         <w:spacing w:after="120" w:line="280"/>
       </w:pPr>
       <w:r>
-        <w:t xml:space="preserve">Private, brand-trained AI model — the flagship long-term differentiator. Instead of a generic model answering from public data, this is trained continuously on each brand's own sales, inventory, and customer history. It moves the product from "here's what happened" to "here's what to do next": which SKUs to discount before they go stale, which channel is under- or over-funded, which customer cohort is about to churn and what offer might save them. The model gets sharper the longer a brand stays on the platform — a data flywheel that's genuinely hard for a dashboard-only competitor to copy. This is a build target for the India Scale phase (Section 8), not a feature live today.</w:t>
+        <w:t xml:space="preserve">Private, brand-trained AI model — the flagship long-term differentiator. Instead of a generic model answering from public data, this is trained continuously on each brand's own sales, inventory, and customer history. It moves the product from "here's what happened" to "here's what to do next": which SKUs to discount before they go stale, which channel is under- or over-funded, which customer cohort is about to churn and what offer might save them. The model gets sharper the longer a brand stays on the platform — a data flywheel that's genuinely hard for a dashboard-only competitor to copy. This is a build target for the India Scale phase (Section 9), not a feature live today.</w:t>
       </w:r>
     </w:p>
     <w:p>
@@ -1624,7 +2094,7 @@
           <w:sz w:val="26"/>
           <w:szCs w:val="26"/>
         </w:rPr>
-        <w:t xml:space="preserve">5.2 Growth &amp; marketing depth</w:t>
+        <w:t xml:space="preserve">6.2 Growth &amp; marketing depth</w:t>
       </w:r>
     </w:p>
     <w:p>
@@ -1693,7 +2163,7 @@
           <w:sz w:val="26"/>
           <w:szCs w:val="26"/>
         </w:rPr>
-        <w:t xml:space="preserve">5.3 Operations &amp; trust</w:t>
+        <w:t xml:space="preserve">6.3 Operations &amp; trust</w:t>
       </w:r>
     </w:p>
     <w:p>
@@ -1749,7 +2219,7 @@
           <w:sz w:val="26"/>
           <w:szCs w:val="26"/>
         </w:rPr>
-        <w:t xml:space="preserve">5.4 Scale &amp; collaboration</w:t>
+        <w:t xml:space="preserve">6.4 Scale &amp; collaboration</w:t>
       </w:r>
     </w:p>
     <w:p>
@@ -1821,7 +2291,7 @@
           <w:sz w:val="32"/>
           <w:szCs w:val="32"/>
         </w:rPr>
-        <w:t xml:space="preserve">6. Business Model &amp; Go-To-Market at Global Scale</w:t>
+        <w:t xml:space="preserve">7. Business Model &amp; Go-To-Market at Global Scale</w:t>
       </w:r>
     </w:p>
     <w:p>
@@ -1863,7 +2333,7 @@
           <w:sz w:val="32"/>
           <w:szCs w:val="32"/>
         </w:rPr>
-        <w:t xml:space="preserve">7. Risk Register — Global Scope</w:t>
+        <w:t xml:space="preserve">8. Risk Register — Global Scope</w:t>
       </w:r>
     </w:p>
     <w:tbl>
@@ -2146,7 +2616,7 @@
                 <w:sz w:val="20"/>
                 <w:szCs w:val="20"/>
               </w:rPr>
-              <w:t xml:space="preserve">Section 5's list is long and unvalidated</w:t>
+              <w:t xml:space="preserve">Section 6's list is long and unvalidated</w:t>
             </w:r>
           </w:p>
         </w:tc>
@@ -2243,7 +2713,7 @@
           <w:sz w:val="32"/>
           <w:szCs w:val="32"/>
         </w:rPr>
-        <w:t xml:space="preserve">8. The Phased Plan — India Immersion First</w:t>
+        <w:t xml:space="preserve">9. The Phased Plan — India Immersion First</w:t>
       </w:r>
     </w:p>
     <w:p>
@@ -2254,7 +2724,7 @@
         <w:rPr>
           <w:color w:val="1B1F3B"/>
         </w:rPr>
-        <w:t xml:space="preserve">This is the answer to "what do I actually do": prove the India wedge completely before spending a single dollar on global positioning. Outreach to Indian D2C brand founders is already underway — early conversations are being used right now to pressure-test the feature list in Section 5 and finalize which integrations matter most, before any production code is written. The table below is the same roadmap used in the pitch deck — phases 01–02 are what a pre-seed raise completes; 03–05 are the vision that path validates, not something being asked for today.</w:t>
+        <w:t xml:space="preserve">This is the answer to "what do I actually do": prove the India wedge completely before spending a single dollar on global positioning. Outreach to Indian D2C brand founders is already underway — early conversations are being used right now to pressure-test the feature list in Section 6 and finalize which integrations matter most, before any production code is written. The table below is the same roadmap used in the pitch deck — phases 01–02 are what a pre-seed raise completes; 03–05 are the vision that path validates, not something being asked for today.</w:t>
       </w:r>
     </w:p>
     <w:tbl>
@@ -2697,7 +3167,7 @@
           <w:sz w:val="32"/>
           <w:szCs w:val="32"/>
         </w:rPr>
-        <w:t xml:space="preserve">9. Bottom Line</w:t>
+        <w:t xml:space="preserve">10. Bottom Line</w:t>
       </w:r>
     </w:p>
     <w:p>
@@ -2764,7 +3234,7 @@
           <w:iCs/>
           <w:color w:val="1B1F3B"/>
         </w:rPr>
-        <w:t xml:space="preserve">Grand View Research — B2C E-commerce Market Size And Share Report, 2026–2033. Mordor Intelligence — India D2C E-commerce Market Analysis (2026). Triple Whale Help Center — currency support article. DealStreetAsia, TechCrunch, Tracxn — Plugo Series A coverage. G2 review pages and vendor pricing pages for Triple Whale, Polar Analytics, Northbeam, Rockerbox, Daasity, Glew.io, Lifesight, Putler. All confidence tags reflect the discipline established across the Ecommerce Hub vault research: verified facts are independently confirmed via primary sources; vendor claims are marketing-only; inference is original synthesis, always flagged as such.</w:t>
+        <w:t xml:space="preserve">Grand View Research — B2C E-commerce Market Size And Share Report, 2026–2033. Mordor Intelligence — India D2C E-commerce Market Analysis (2026) and India Payment Gateway Market report. Triple Whale Help Center — currency support article. DealStreetAsia, TechCrunch, Tracxn — Plugo Series A coverage. G2 review pages and vendor pricing pages for Triple Whale, Polar Analytics, Northbeam, Rockerbox, Daasity, Glew.io, Lifesight, Putler. Connector landscape (Section 5) cross-checked across multiple current industry roundups on Indian payment gateways, shipping aggregators, WhatsApp Business API providers, ecommerce platforms, and D2C tooling. All confidence tags reflect the discipline established across the Ecommerce Hub vault research: verified facts are independently confirmed via primary sources; vendor claims are marketing-only; inference is original synthesis, always flagged as such.</w:t>
       </w:r>
     </w:p>
     <w:sectPr>

</xml_diff>

<commit_message>
Remove product pricing, add consolidation value-prop (one dashboard vs 10 tools)
</commit_message>
<xml_diff>
--- a/A priyam ka patora/Startup Ideas/03 - Ecommerce Hub/Ecommerce_Hub_Global_Report.docx
+++ b/A priyam ka patora/Startup Ideas/03 - Ecommerce Hub/Ecommerce_Hub_Global_Report.docx
@@ -1957,6 +1957,57 @@
     </w:p>
     <w:p>
       <w:pPr>
+        <w:pStyle w:val="Heading2"/>
+        <w:spacing w:after="140" w:before="280"/>
+      </w:pPr>
+      <w:r>
+        <w:rPr>
+          <w:rFonts w:ascii="Cambria" w:cs="Cambria" w:eastAsia="Cambria" w:hAnsi="Cambria"/>
+          <w:b/>
+          <w:bCs/>
+          <w:color w:val="F96167"/>
+          <w:sz w:val="26"/>
+          <w:szCs w:val="26"/>
+        </w:rPr>
+        <w:t xml:space="preserve">5.1 Why consolidate — the actual pitch to a brand owner</w:t>
+      </w:r>
+    </w:p>
+    <w:p>
+      <w:pPr>
+        <w:spacing w:after="200" w:line="300"/>
+      </w:pPr>
+      <w:r>
+        <w:rPr>
+          <w:color w:val="1B1F3B"/>
+        </w:rPr>
+        <w:t xml:space="preserve">Line up the six categories above against how a real D2C brand operates today, and the count is stark: a web/app analytics tool, a WhatsApp automation tool, an email/SMS automation tool, a payment gateway dashboard, a logistics/shipping dashboard, a warehouse inventory &amp; monitoring tool, several marketplace-specific panels (Amazon, Flipkart, Myntra...), and an ads reporting tool — eight or more separate subscriptions, logins, and data silos just to run one storefront. The pitch to a brand owner is simple: reconcile all of it in one dashboard instead of checking eight tools one at a time to answer one question.</w:t>
+      </w:r>
+    </w:p>
+    <w:p>
+      <w:pPr>
+        <w:spacing w:after="200" w:line="300"/>
+      </w:pPr>
+      <w:r>
+        <w:rPr>
+          <w:b/>
+          <w:bCs/>
+          <w:color w:val="FFFFFF"/>
+          <w:sz w:val="17"/>
+          <w:szCs w:val="17"/>
+          <w:shd w:fill="F96167" w:val="clear"/>
+        </w:rPr>
+        <w:t xml:space="preserve"> INFERENCE </w:t>
+      </w:r>
+      <w:r>
+        <w:rPr>
+          <w:sz w:val="22"/>
+          <w:szCs w:val="22"/>
+        </w:rPr>
+        <w:t xml:space="preserve">  Important distinction on what "one dashboard" means here: this is not a plan to become a payments company or a logistics company. The product connects to a brand's existing payment gateway, logistics provider, and marketplaces as-is — those stay third-party, "out-house" relationships, just integrated into one view. WhatsApp automation, email/SMS automation, and warehouse monitoring are the pieces built in-house, natively inside the dashboard, rather than resold third-party widgets. The value is in the reconciliation and automation layer, not in replacing the underlying infrastructure.</w:t>
+      </w:r>
+    </w:p>
+    <w:p>
+      <w:pPr>
         <w:pStyle w:val="Heading1"/>
         <w:pBdr>
           <w:top w:val="single" w:color="F96167" w:sz="14" w:space="8"/>
@@ -2302,7 +2353,7 @@
         <w:rPr>
           <w:color w:val="1B1F3B"/>
         </w:rPr>
-        <w:t xml:space="preserve">The India-first pricing ($50–$300/month) was benchmarked against Triple Whale and Putler's real published tiers, and roughly holds globally — but multi-currency billing, regional payment processing (Stripe vs. Razorpay vs. Mercado Pago vs. GrabPay), and regional tax/VAT handling become real engineering and legal costs that don't exist in an India-only version.</w:t>
+        <w:t xml:space="preserve">India-first pricing isn't locked yet — it's set with design partners, benchmarked loosely against Triple Whale and Putler's published tiers. Whatever that number turns out to be, multi-currency billing, regional payment processing (Stripe vs. Razorpay vs. Mercado Pago vs. GrabPay), and regional tax/VAT handling become real engineering and legal costs globally that don't exist in an India-only version.</w:t>
       </w:r>
     </w:p>
     <w:p>

</xml_diff>